<commit_message>
docs(delivery): add engineering practice submission package
</commit_message>
<xml_diff>
--- a/docx/word/06_轴承寿命预测与故障诊断系统_项目管理计划文档_zyj.docx
+++ b/docx/word/06_轴承寿命预测与故障诊断系统_项目管理计划文档_zyj.docx
@@ -4,15 +4,9 @@
   <w:body>
     <w:p>
       <w:pPr>
-        <w:spacing w:before="120" w:after="200" w:line="264" w:lineRule="auto"/>
+        <w:pStyle w:val="Heading1"/>
       </w:pPr>
       <w:r>
-        <w:rPr>
-          <w:rFonts w:ascii="Calibri" w:hAnsi="Calibri" w:eastAsia="Songti SC"/>
-          <w:b/>
-          <w:color w:val="000000"/>
-          <w:sz w:val="40"/>
-        </w:rPr>
         <w:t>轴承寿命预测与故障诊断系统：项目管理计划文档</w:t>
       </w:r>
     </w:p>
@@ -20,69 +14,29 @@
       <w:tblPr>
         <w:tblStyle w:val="TableGrid"/>
         <w:tblW w:type="auto" w:w="0"/>
-        <w:jc w:val="center"/>
-        <w:tblLayout w:type="autofit"/>
         <w:tblLook w:firstColumn="1" w:firstRow="1" w:lastColumn="0" w:lastRow="0" w:noHBand="0" w:noVBand="1" w:val="04A0"/>
       </w:tblPr>
       <w:tblGrid>
-        <w:gridCol w:w="4680"/>
-        <w:gridCol w:w="4680"/>
+        <w:gridCol w:w="4320"/>
+        <w:gridCol w:w="4320"/>
       </w:tblGrid>
       <w:tr>
         <w:tc>
           <w:tcPr>
-            <w:tcW w:type="dxa" w:w="4680"/>
-            <w:shd w:fill="F2F4F7"/>
-            <w:vAlign w:val="center"/>
-            <w:tcMar>
-              <w:top w:w="80" w:type="dxa"/>
-              <w:bottom w:w="80" w:type="dxa"/>
-              <w:start w:w="120" w:type="dxa"/>
-              <w:end w:w="120" w:type="dxa"/>
-            </w:tcMar>
+            <w:tcW w:type="dxa" w:w="4320"/>
           </w:tcPr>
           <w:p>
-            <w:pPr>
-              <w:spacing w:before="0" w:after="0" w:line="264" w:lineRule="auto"/>
-              <w:jc w:val="center"/>
-            </w:pPr>
-            <w:r/>
             <w:r>
-              <w:rPr>
-                <w:rFonts w:ascii="Calibri" w:hAnsi="Calibri" w:eastAsia="Songti SC"/>
-                <w:b/>
-                <w:color w:val="000000"/>
-                <w:sz w:val="19"/>
-              </w:rPr>
               <w:t>字段</w:t>
             </w:r>
           </w:p>
         </w:tc>
         <w:tc>
           <w:tcPr>
-            <w:tcW w:type="dxa" w:w="4680"/>
-            <w:shd w:fill="F2F4F7"/>
-            <w:vAlign w:val="center"/>
-            <w:tcMar>
-              <w:top w:w="80" w:type="dxa"/>
-              <w:bottom w:w="80" w:type="dxa"/>
-              <w:start w:w="120" w:type="dxa"/>
-              <w:end w:w="120" w:type="dxa"/>
-            </w:tcMar>
+            <w:tcW w:type="dxa" w:w="4320"/>
           </w:tcPr>
           <w:p>
-            <w:pPr>
-              <w:spacing w:before="0" w:after="0" w:line="264" w:lineRule="auto"/>
-              <w:jc w:val="center"/>
-            </w:pPr>
-            <w:r/>
             <w:r>
-              <w:rPr>
-                <w:rFonts w:ascii="Calibri" w:hAnsi="Calibri" w:eastAsia="Songti SC"/>
-                <w:b/>
-                <w:color w:val="000000"/>
-                <w:sz w:val="19"/>
-              </w:rPr>
               <w:t>内容</w:t>
             </w:r>
           </w:p>
@@ -91,56 +45,20 @@
       <w:tr>
         <w:tc>
           <w:tcPr>
-            <w:tcW w:type="dxa" w:w="4680"/>
-            <w:vAlign w:val="center"/>
-            <w:tcMar>
-              <w:top w:w="80" w:type="dxa"/>
-              <w:bottom w:w="80" w:type="dxa"/>
-              <w:start w:w="120" w:type="dxa"/>
-              <w:end w:w="120" w:type="dxa"/>
-            </w:tcMar>
+            <w:tcW w:type="dxa" w:w="4320"/>
           </w:tcPr>
           <w:p>
-            <w:pPr>
-              <w:spacing w:before="0" w:after="0" w:line="264" w:lineRule="auto"/>
-              <w:jc w:val="center"/>
-            </w:pPr>
-            <w:r/>
             <w:r>
-              <w:rPr>
-                <w:rFonts w:ascii="Calibri" w:hAnsi="Calibri" w:eastAsia="Songti SC"/>
-                <w:b w:val="0"/>
-                <w:color w:val="000000"/>
-                <w:sz w:val="19"/>
-              </w:rPr>
               <w:t>项目名称</w:t>
             </w:r>
           </w:p>
         </w:tc>
         <w:tc>
           <w:tcPr>
-            <w:tcW w:type="dxa" w:w="4680"/>
-            <w:vAlign w:val="center"/>
-            <w:tcMar>
-              <w:top w:w="80" w:type="dxa"/>
-              <w:bottom w:w="80" w:type="dxa"/>
-              <w:start w:w="120" w:type="dxa"/>
-              <w:end w:w="120" w:type="dxa"/>
-            </w:tcMar>
+            <w:tcW w:type="dxa" w:w="4320"/>
           </w:tcPr>
           <w:p>
-            <w:pPr>
-              <w:spacing w:before="0" w:after="0" w:line="264" w:lineRule="auto"/>
-              <w:jc w:val="center"/>
-            </w:pPr>
-            <w:r/>
             <w:r>
-              <w:rPr>
-                <w:rFonts w:ascii="Calibri" w:hAnsi="Calibri" w:eastAsia="Songti SC"/>
-                <w:b w:val="0"/>
-                <w:color w:val="000000"/>
-                <w:sz w:val="19"/>
-              </w:rPr>
               <w:t>轴承寿命预测与故障诊断系统</w:t>
             </w:r>
           </w:p>
@@ -149,56 +67,20 @@
       <w:tr>
         <w:tc>
           <w:tcPr>
-            <w:tcW w:type="dxa" w:w="4680"/>
-            <w:vAlign w:val="center"/>
-            <w:tcMar>
-              <w:top w:w="80" w:type="dxa"/>
-              <w:bottom w:w="80" w:type="dxa"/>
-              <w:start w:w="120" w:type="dxa"/>
-              <w:end w:w="120" w:type="dxa"/>
-            </w:tcMar>
+            <w:tcW w:type="dxa" w:w="4320"/>
           </w:tcPr>
           <w:p>
-            <w:pPr>
-              <w:spacing w:before="0" w:after="0" w:line="264" w:lineRule="auto"/>
-              <w:jc w:val="center"/>
-            </w:pPr>
-            <w:r/>
             <w:r>
-              <w:rPr>
-                <w:rFonts w:ascii="Calibri" w:hAnsi="Calibri" w:eastAsia="Songti SC"/>
-                <w:b w:val="0"/>
-                <w:color w:val="000000"/>
-                <w:sz w:val="19"/>
-              </w:rPr>
               <w:t>小组成员</w:t>
             </w:r>
           </w:p>
         </w:tc>
         <w:tc>
           <w:tcPr>
-            <w:tcW w:type="dxa" w:w="4680"/>
-            <w:vAlign w:val="center"/>
-            <w:tcMar>
-              <w:top w:w="80" w:type="dxa"/>
-              <w:bottom w:w="80" w:type="dxa"/>
-              <w:start w:w="120" w:type="dxa"/>
-              <w:end w:w="120" w:type="dxa"/>
-            </w:tcMar>
+            <w:tcW w:type="dxa" w:w="4320"/>
           </w:tcPr>
           <w:p>
-            <w:pPr>
-              <w:spacing w:before="0" w:after="0" w:line="264" w:lineRule="auto"/>
-              <w:jc w:val="center"/>
-            </w:pPr>
-            <w:r/>
             <w:r>
-              <w:rPr>
-                <w:rFonts w:ascii="Calibri" w:hAnsi="Calibri" w:eastAsia="Songti SC"/>
-                <w:b w:val="0"/>
-                <w:color w:val="000000"/>
-                <w:sz w:val="19"/>
-              </w:rPr>
               <w:t>zyj、zdh、cyj、zy</w:t>
             </w:r>
           </w:p>
@@ -207,56 +89,20 @@
       <w:tr>
         <w:tc>
           <w:tcPr>
-            <w:tcW w:type="dxa" w:w="4680"/>
-            <w:vAlign w:val="center"/>
-            <w:tcMar>
-              <w:top w:w="80" w:type="dxa"/>
-              <w:bottom w:w="80" w:type="dxa"/>
-              <w:start w:w="120" w:type="dxa"/>
-              <w:end w:w="120" w:type="dxa"/>
-            </w:tcMar>
+            <w:tcW w:type="dxa" w:w="4320"/>
           </w:tcPr>
           <w:p>
-            <w:pPr>
-              <w:spacing w:before="0" w:after="0" w:line="264" w:lineRule="auto"/>
-              <w:jc w:val="center"/>
-            </w:pPr>
-            <w:r/>
             <w:r>
-              <w:rPr>
-                <w:rFonts w:ascii="Calibri" w:hAnsi="Calibri" w:eastAsia="Songti SC"/>
-                <w:b w:val="0"/>
-                <w:color w:val="000000"/>
-                <w:sz w:val="19"/>
-              </w:rPr>
               <w:t>组长</w:t>
             </w:r>
           </w:p>
         </w:tc>
         <w:tc>
           <w:tcPr>
-            <w:tcW w:type="dxa" w:w="4680"/>
-            <w:vAlign w:val="center"/>
-            <w:tcMar>
-              <w:top w:w="80" w:type="dxa"/>
-              <w:bottom w:w="80" w:type="dxa"/>
-              <w:start w:w="120" w:type="dxa"/>
-              <w:end w:w="120" w:type="dxa"/>
-            </w:tcMar>
+            <w:tcW w:type="dxa" w:w="4320"/>
           </w:tcPr>
           <w:p>
-            <w:pPr>
-              <w:spacing w:before="0" w:after="0" w:line="264" w:lineRule="auto"/>
-              <w:jc w:val="center"/>
-            </w:pPr>
-            <w:r/>
             <w:r>
-              <w:rPr>
-                <w:rFonts w:ascii="Calibri" w:hAnsi="Calibri" w:eastAsia="Songti SC"/>
-                <w:b w:val="0"/>
-                <w:color w:val="000000"/>
-                <w:sz w:val="19"/>
-              </w:rPr>
               <w:t>zyj</w:t>
             </w:r>
           </w:p>
@@ -265,57 +111,21 @@
       <w:tr>
         <w:tc>
           <w:tcPr>
-            <w:tcW w:type="dxa" w:w="4680"/>
-            <w:vAlign w:val="center"/>
-            <w:tcMar>
-              <w:top w:w="80" w:type="dxa"/>
-              <w:bottom w:w="80" w:type="dxa"/>
-              <w:start w:w="120" w:type="dxa"/>
-              <w:end w:w="120" w:type="dxa"/>
-            </w:tcMar>
+            <w:tcW w:type="dxa" w:w="4320"/>
           </w:tcPr>
           <w:p>
-            <w:pPr>
-              <w:spacing w:before="0" w:after="0" w:line="264" w:lineRule="auto"/>
-              <w:jc w:val="center"/>
-            </w:pPr>
-            <w:r/>
             <w:r>
-              <w:rPr>
-                <w:rFonts w:ascii="Calibri" w:hAnsi="Calibri" w:eastAsia="Songti SC"/>
-                <w:b w:val="0"/>
-                <w:color w:val="000000"/>
-                <w:sz w:val="19"/>
-              </w:rPr>
               <w:t>文档版本</w:t>
             </w:r>
           </w:p>
         </w:tc>
         <w:tc>
           <w:tcPr>
-            <w:tcW w:type="dxa" w:w="4680"/>
-            <w:vAlign w:val="center"/>
-            <w:tcMar>
-              <w:top w:w="80" w:type="dxa"/>
-              <w:bottom w:w="80" w:type="dxa"/>
-              <w:start w:w="120" w:type="dxa"/>
-              <w:end w:w="120" w:type="dxa"/>
-            </w:tcMar>
+            <w:tcW w:type="dxa" w:w="4320"/>
           </w:tcPr>
           <w:p>
-            <w:pPr>
-              <w:spacing w:before="0" w:after="0" w:line="264" w:lineRule="auto"/>
-              <w:jc w:val="center"/>
-            </w:pPr>
-            <w:r/>
             <w:r>
-              <w:rPr>
-                <w:rFonts w:ascii="Calibri" w:hAnsi="Calibri" w:eastAsia="Songti SC"/>
-                <w:b w:val="0"/>
-                <w:color w:val="000000"/>
-                <w:sz w:val="19"/>
-              </w:rPr>
-              <w:t>v1.0</w:t>
+              <w:t>v2.0</w:t>
             </w:r>
           </w:p>
         </w:tc>
@@ -323,56 +133,20 @@
       <w:tr>
         <w:tc>
           <w:tcPr>
-            <w:tcW w:type="dxa" w:w="4680"/>
-            <w:vAlign w:val="center"/>
-            <w:tcMar>
-              <w:top w:w="80" w:type="dxa"/>
-              <w:bottom w:w="80" w:type="dxa"/>
-              <w:start w:w="120" w:type="dxa"/>
-              <w:end w:w="120" w:type="dxa"/>
-            </w:tcMar>
+            <w:tcW w:type="dxa" w:w="4320"/>
           </w:tcPr>
           <w:p>
-            <w:pPr>
-              <w:spacing w:before="0" w:after="0" w:line="264" w:lineRule="auto"/>
-              <w:jc w:val="center"/>
-            </w:pPr>
-            <w:r/>
             <w:r>
-              <w:rPr>
-                <w:rFonts w:ascii="Calibri" w:hAnsi="Calibri" w:eastAsia="Songti SC"/>
-                <w:b w:val="0"/>
-                <w:color w:val="000000"/>
-                <w:sz w:val="19"/>
-              </w:rPr>
               <w:t>日期</w:t>
             </w:r>
           </w:p>
         </w:tc>
         <w:tc>
           <w:tcPr>
-            <w:tcW w:type="dxa" w:w="4680"/>
-            <w:vAlign w:val="center"/>
-            <w:tcMar>
-              <w:top w:w="80" w:type="dxa"/>
-              <w:bottom w:w="80" w:type="dxa"/>
-              <w:start w:w="120" w:type="dxa"/>
-              <w:end w:w="120" w:type="dxa"/>
-            </w:tcMar>
+            <w:tcW w:type="dxa" w:w="4320"/>
           </w:tcPr>
           <w:p>
-            <w:pPr>
-              <w:spacing w:before="0" w:after="0" w:line="264" w:lineRule="auto"/>
-              <w:jc w:val="center"/>
-            </w:pPr>
-            <w:r/>
             <w:r>
-              <w:rPr>
-                <w:rFonts w:ascii="Calibri" w:hAnsi="Calibri" w:eastAsia="Songti SC"/>
-                <w:b w:val="0"/>
-                <w:color w:val="000000"/>
-                <w:sz w:val="19"/>
-              </w:rPr>
               <w:t>2026年6月</w:t>
             </w:r>
           </w:p>
@@ -381,220 +155,430 @@
     </w:tbl>
     <w:p>
       <w:pPr>
-        <w:spacing w:before="0" w:after="120" w:line="264" w:lineRule="auto"/>
-      </w:pPr>
-    </w:p>
-    <w:p>
-      <w:pPr>
-        <w:spacing w:before="320" w:after="160" w:line="264" w:lineRule="auto"/>
+        <w:pStyle w:val="Heading2"/>
       </w:pPr>
       <w:r>
-        <w:rPr>
-          <w:rFonts w:ascii="Calibri" w:hAnsi="Calibri" w:eastAsia="Songti SC"/>
-          <w:b/>
-          <w:color w:val="2E74B5"/>
-          <w:sz w:val="32"/>
-        </w:rPr>
         <w:t>课程要求梳理</w:t>
       </w:r>
     </w:p>
     <w:p>
+      <w:r>
+        <w:t>本文件对应《工程实践各阶段要求》和《工程实践管理规范2025》中的 **开题阶段** 工作产品：**项目管理计划文档**。覆盖 WBS、组织结构、工作量、进度、风险、配置和过程模型。</w:t>
+      </w:r>
+    </w:p>
+    <w:tbl>
+      <w:tblPr>
+        <w:tblStyle w:val="TableGrid"/>
+        <w:tblW w:type="auto" w:w="0"/>
+        <w:tblLook w:firstColumn="1" w:firstRow="1" w:lastColumn="0" w:lastRow="0" w:noHBand="0" w:noVBand="1" w:val="04A0"/>
+      </w:tblPr>
+      <w:tblGrid>
+        <w:gridCol w:w="2880"/>
+        <w:gridCol w:w="2880"/>
+        <w:gridCol w:w="2880"/>
+      </w:tblGrid>
+      <w:tr>
+        <w:tc>
+          <w:tcPr>
+            <w:tcW w:type="dxa" w:w="2880"/>
+          </w:tcPr>
+          <w:p>
+            <w:r>
+              <w:t>要求来源</w:t>
+            </w:r>
+          </w:p>
+        </w:tc>
+        <w:tc>
+          <w:tcPr>
+            <w:tcW w:type="dxa" w:w="2880"/>
+          </w:tcPr>
+          <w:p>
+            <w:r>
+              <w:t>关键要求</w:t>
+            </w:r>
+          </w:p>
+        </w:tc>
+        <w:tc>
+          <w:tcPr>
+            <w:tcW w:type="dxa" w:w="2880"/>
+          </w:tcPr>
+          <w:p>
+            <w:r>
+              <w:t>本文响应</w:t>
+            </w:r>
+          </w:p>
+        </w:tc>
+      </w:tr>
+      <w:tr>
+        <w:tc>
+          <w:tcPr>
+            <w:tcW w:type="dxa" w:w="2880"/>
+          </w:tcPr>
+          <w:p>
+            <w:r>
+              <w:t>工程实践各阶段要求</w:t>
+            </w:r>
+          </w:p>
+        </w:tc>
+        <w:tc>
+          <w:tcPr>
+            <w:tcW w:type="dxa" w:w="2880"/>
+          </w:tcPr>
+          <w:p>
+            <w:r>
+              <w:t>完成阶段任务并提交对应工作产品</w:t>
+            </w:r>
+          </w:p>
+        </w:tc>
+        <w:tc>
+          <w:tcPr>
+            <w:tcW w:type="dxa" w:w="2880"/>
+          </w:tcPr>
+          <w:p>
+            <w:r>
+              <w:t>本文按阶段产物补充内容和证据</w:t>
+            </w:r>
+          </w:p>
+        </w:tc>
+      </w:tr>
+      <w:tr>
+        <w:tc>
+          <w:tcPr>
+            <w:tcW w:type="dxa" w:w="2880"/>
+          </w:tcPr>
+          <w:p>
+            <w:r>
+              <w:t>工程实践管理规范2025</w:t>
+            </w:r>
+          </w:p>
+        </w:tc>
+        <w:tc>
+          <w:tcPr>
+            <w:tcW w:type="dxa" w:w="2880"/>
+          </w:tcPr>
+          <w:p>
+            <w:r>
+              <w:t>文档、代码、演示和过程管理需要可审查</w:t>
+            </w:r>
+          </w:p>
+        </w:tc>
+        <w:tc>
+          <w:tcPr>
+            <w:tcW w:type="dxa" w:w="2880"/>
+          </w:tcPr>
+          <w:p>
+            <w:r>
+              <w:t>本文引用仓库路径、测试和演示材料</w:t>
+            </w:r>
+          </w:p>
+        </w:tc>
+      </w:tr>
+      <w:tr>
+        <w:tc>
+          <w:tcPr>
+            <w:tcW w:type="dxa" w:w="2880"/>
+          </w:tcPr>
+          <w:p>
+            <w:r>
+              <w:t>课程结题归档</w:t>
+            </w:r>
+          </w:p>
+        </w:tc>
+        <w:tc>
+          <w:tcPr>
+            <w:tcW w:type="dxa" w:w="2880"/>
+          </w:tcPr>
+          <w:p>
+            <w:r>
+              <w:t>电子文档统一压缩提交</w:t>
+            </w:r>
+          </w:p>
+        </w:tc>
+        <w:tc>
+          <w:tcPr>
+            <w:tcW w:type="dxa" w:w="2880"/>
+          </w:tcPr>
+          <w:p>
+            <w:r>
+              <w:t>交付索引和 zip 包在 `delivery`</w:t>
+            </w:r>
+          </w:p>
+        </w:tc>
+      </w:tr>
+    </w:tbl>
+    <w:p>
       <w:pPr>
-        <w:spacing w:before="0" w:after="120" w:line="264" w:lineRule="auto"/>
+        <w:pStyle w:val="Heading2"/>
       </w:pPr>
       <w:r>
-        <w:rPr>
-          <w:rFonts w:ascii="Calibri" w:hAnsi="Calibri" w:eastAsia="Songti SC"/>
-          <w:color w:val="000000"/>
-          <w:sz w:val="22"/>
-        </w:rPr>
-        <w:t>根据《工程实践各阶段要求》和《工程实践管理规范2025》，本项目按开题、中期、结题三个阶段组织材料。开题阶段需要完成技术预研、需求分析、SRS、确认测试计划和项目管理计划；中期阶段需要提交设计文档、单元测试计划、集成测试计划、编码规范、UML 设计和核心代码；结题阶段需要提交结题报告、测试报告、用户手册、安装配置手册、项目技术论文、源码和成员贡献说明。答辩材料需要服务于演示，不替代正文文档。</w:t>
+        <w:t>项目事实基线</w:t>
       </w:r>
     </w:p>
     <w:p>
       <w:pPr>
-        <w:spacing w:before="0" w:after="120" w:line="264" w:lineRule="auto"/>
+        <w:pStyle w:val="ListBullet"/>
       </w:pPr>
       <w:r>
-        <w:rPr>
-          <w:rFonts w:ascii="Calibri" w:hAnsi="Calibri" w:eastAsia="Songti SC"/>
-          <w:color w:val="000000"/>
-          <w:sz w:val="22"/>
-        </w:rPr>
-        <w:t xml:space="preserve">本仓库当前交付采用 </w:t>
-      </w:r>
-      <w:r>
-        <w:rPr>
-          <w:rFonts w:ascii="Menlo" w:hAnsi="Menlo" w:eastAsia="Songti SC"/>
-          <w:color w:val="000000"/>
-          <w:sz w:val="20"/>
-        </w:rPr>
-        <w:t>docx/md</w:t>
-      </w:r>
-      <w:r>
-        <w:rPr>
-          <w:rFonts w:ascii="Calibri" w:hAnsi="Calibri" w:eastAsia="Songti SC"/>
-          <w:color w:val="000000"/>
-          <w:sz w:val="22"/>
-        </w:rPr>
-        <w:t>、</w:t>
-      </w:r>
-      <w:r>
-        <w:rPr>
-          <w:rFonts w:ascii="Menlo" w:hAnsi="Menlo" w:eastAsia="Songti SC"/>
-          <w:color w:val="000000"/>
-          <w:sz w:val="20"/>
-        </w:rPr>
-        <w:t>docx/word</w:t>
-      </w:r>
-      <w:r>
-        <w:rPr>
-          <w:rFonts w:ascii="Calibri" w:hAnsi="Calibri" w:eastAsia="Songti SC"/>
-          <w:color w:val="000000"/>
-          <w:sz w:val="22"/>
-        </w:rPr>
-        <w:t>、</w:t>
-      </w:r>
-      <w:r>
-        <w:rPr>
-          <w:rFonts w:ascii="Menlo" w:hAnsi="Menlo" w:eastAsia="Songti SC"/>
-          <w:color w:val="000000"/>
-          <w:sz w:val="20"/>
-        </w:rPr>
-        <w:t>docx/pdf</w:t>
-      </w:r>
-      <w:r>
-        <w:rPr>
-          <w:rFonts w:ascii="Calibri" w:hAnsi="Calibri" w:eastAsia="Songti SC"/>
-          <w:color w:val="000000"/>
-          <w:sz w:val="22"/>
-        </w:rPr>
-        <w:t>、</w:t>
-      </w:r>
-      <w:r>
-        <w:rPr>
-          <w:rFonts w:ascii="Menlo" w:hAnsi="Menlo" w:eastAsia="Songti SC"/>
-          <w:color w:val="000000"/>
-          <w:sz w:val="20"/>
-        </w:rPr>
-        <w:t>docx/img</w:t>
-      </w:r>
-      <w:r>
-        <w:rPr>
-          <w:rFonts w:ascii="Calibri" w:hAnsi="Calibri" w:eastAsia="Songti SC"/>
-          <w:color w:val="000000"/>
-          <w:sz w:val="22"/>
-        </w:rPr>
-        <w:t xml:space="preserve"> 四类目录保存源文档、Word、PDF 和图表。代码托管使用 GitHub 仓库 </w:t>
-      </w:r>
-      <w:r>
-        <w:rPr>
-          <w:rFonts w:ascii="Menlo" w:hAnsi="Menlo" w:eastAsia="Songti SC"/>
-          <w:color w:val="000000"/>
-          <w:sz w:val="20"/>
-        </w:rPr>
-        <w:t>nev8r/phm</w:t>
-      </w:r>
-      <w:r>
-        <w:rPr>
-          <w:rFonts w:ascii="Calibri" w:hAnsi="Calibri" w:eastAsia="Songti SC"/>
-          <w:color w:val="000000"/>
-          <w:sz w:val="22"/>
-        </w:rPr>
-        <w:t xml:space="preserve"> 的 </w:t>
-      </w:r>
-      <w:r>
-        <w:rPr>
-          <w:rFonts w:ascii="Menlo" w:hAnsi="Menlo" w:eastAsia="Songti SC"/>
-          <w:color w:val="000000"/>
-          <w:sz w:val="20"/>
-        </w:rPr>
-        <w:t>phm2</w:t>
-      </w:r>
-      <w:r>
-        <w:rPr>
-          <w:rFonts w:ascii="Calibri" w:hAnsi="Calibri" w:eastAsia="Songti SC"/>
-          <w:color w:val="000000"/>
-          <w:sz w:val="22"/>
-        </w:rPr>
-        <w:t xml:space="preserve"> 分支，依赖与环境通过 </w:t>
-      </w:r>
-      <w:r>
-        <w:rPr>
-          <w:rFonts w:ascii="Menlo" w:hAnsi="Menlo" w:eastAsia="Songti SC"/>
-          <w:color w:val="000000"/>
-          <w:sz w:val="20"/>
-        </w:rPr>
-        <w:t>uv</w:t>
-      </w:r>
-      <w:r>
-        <w:rPr>
-          <w:rFonts w:ascii="Calibri" w:hAnsi="Calibri" w:eastAsia="Songti SC"/>
-          <w:color w:val="000000"/>
-          <w:sz w:val="22"/>
-        </w:rPr>
-        <w:t>、</w:t>
-      </w:r>
-      <w:r>
-        <w:rPr>
-          <w:rFonts w:ascii="Menlo" w:hAnsi="Menlo" w:eastAsia="Songti SC"/>
-          <w:color w:val="000000"/>
-          <w:sz w:val="20"/>
-        </w:rPr>
-        <w:t>.python-version</w:t>
-      </w:r>
-      <w:r>
-        <w:rPr>
-          <w:rFonts w:ascii="Calibri" w:hAnsi="Calibri" w:eastAsia="Songti SC"/>
-          <w:color w:val="000000"/>
-          <w:sz w:val="22"/>
-        </w:rPr>
-        <w:t>、</w:t>
-      </w:r>
-      <w:r>
-        <w:rPr>
-          <w:rFonts w:ascii="Menlo" w:hAnsi="Menlo" w:eastAsia="Songti SC"/>
-          <w:color w:val="000000"/>
-          <w:sz w:val="20"/>
-        </w:rPr>
-        <w:t>pyproject.toml</w:t>
-      </w:r>
-      <w:r>
-        <w:rPr>
-          <w:rFonts w:ascii="Calibri" w:hAnsi="Calibri" w:eastAsia="Songti SC"/>
-          <w:color w:val="000000"/>
-          <w:sz w:val="22"/>
-        </w:rPr>
-        <w:t xml:space="preserve"> 和 </w:t>
-      </w:r>
-      <w:r>
-        <w:rPr>
-          <w:rFonts w:ascii="Menlo" w:hAnsi="Menlo" w:eastAsia="Songti SC"/>
-          <w:color w:val="000000"/>
-          <w:sz w:val="20"/>
-        </w:rPr>
-        <w:t>uv.lock</w:t>
-      </w:r>
-      <w:r>
-        <w:rPr>
-          <w:rFonts w:ascii="Calibri" w:hAnsi="Calibri" w:eastAsia="Songti SC"/>
-          <w:color w:val="000000"/>
-          <w:sz w:val="22"/>
-        </w:rPr>
-        <w:t xml:space="preserve"> 固化。</w:t>
+        <w:t>代码路径：`src/USTC/SSE/BearingPrediction`。</w:t>
       </w:r>
     </w:p>
     <w:p>
       <w:pPr>
-        <w:spacing w:before="320" w:after="160" w:line="264" w:lineRule="auto"/>
+        <w:pStyle w:val="ListBullet"/>
       </w:pPr>
       <w:r>
-        <w:rPr>
-          <w:rFonts w:ascii="Calibri" w:hAnsi="Calibri" w:eastAsia="Songti SC"/>
-          <w:b/>
-          <w:color w:val="2E74B5"/>
-          <w:sz w:val="32"/>
-        </w:rPr>
+        <w:t>对外推荐导入方式：通过安装后的 `phm` 包或 CLI 入口使用，历史物理命名空间保留为 `USTC.SSE.BearingPrediction`。</w:t>
+      </w:r>
+    </w:p>
+    <w:p>
+      <w:pPr>
+        <w:pStyle w:val="ListBullet"/>
+      </w:pPr>
+      <w:r>
+        <w:t>包管理方式：Python 3.11、`uv`、`pyproject.toml`、`uv.lock`。</w:t>
+      </w:r>
+    </w:p>
+    <w:p>
+      <w:pPr>
+        <w:pStyle w:val="ListBullet"/>
+      </w:pPr>
+      <w:r>
+        <w:t>数据入口：`data/loader_roots/phm2012` 和 `data/loader_roots/xjtu`，原始数据不进入 Git。</w:t>
+      </w:r>
+    </w:p>
+    <w:p>
+      <w:pPr>
+        <w:pStyle w:val="ListBullet"/>
+      </w:pPr>
+      <w:r>
+        <w:t>主线数据集：PHM2012/PRONOSTIA 与 XJTU-SY Bearing Datasets。</w:t>
+      </w:r>
+    </w:p>
+    <w:p>
+      <w:pPr>
+        <w:pStyle w:val="ListBullet"/>
+      </w:pPr>
+      <w:r>
+        <w:t>主线任务：RUL 回归、健康状态识别、早期故障识别、故障类型/阶段识别。</w:t>
+      </w:r>
+    </w:p>
+    <w:p>
+      <w:pPr>
+        <w:pStyle w:val="ListBullet"/>
+      </w:pPr>
+      <w:r>
+        <w:t>主要模块：数据加载、样本索引、划分、特征提取、标签构造、任务构造、模型训练、评估、分析和可视化。</w:t>
+      </w:r>
+    </w:p>
+    <w:p>
+      <w:pPr>
+        <w:pStyle w:val="ListBullet"/>
+      </w:pPr>
+      <w:r>
+        <w:t>演示材料：`reports/demo_videos`、`reports/demo_dashboard`、`reports/cli_demo`。</w:t>
+      </w:r>
+    </w:p>
+    <w:p>
+      <w:pPr>
+        <w:pStyle w:val="ListBullet"/>
+      </w:pPr>
+      <w:r>
+        <w:t>结题报告材料：`reports/final_defense/report` 与 `outputs`。</w:t>
+      </w:r>
+    </w:p>
+    <w:p>
+      <w:pPr>
+        <w:pStyle w:val="ListBullet"/>
+      </w:pPr>
+      <w:r>
+        <w:t>课程正式文档：`docx/md`、`docx/word`、`docx/pdf`。</w:t>
+      </w:r>
+    </w:p>
+    <w:p>
+      <w:pPr>
+        <w:pStyle w:val="Heading2"/>
+      </w:pPr>
+      <w:r>
+        <w:t>组织结构</w:t>
+      </w:r>
+    </w:p>
+    <w:tbl>
+      <w:tblPr>
+        <w:tblStyle w:val="TableGrid"/>
+        <w:tblW w:type="auto" w:w="0"/>
+        <w:tblLook w:firstColumn="1" w:firstRow="1" w:lastColumn="0" w:lastRow="0" w:noHBand="0" w:noVBand="1" w:val="04A0"/>
+      </w:tblPr>
+      <w:tblGrid>
+        <w:gridCol w:w="2880"/>
+        <w:gridCol w:w="2880"/>
+        <w:gridCol w:w="2880"/>
+      </w:tblGrid>
+      <w:tr>
+        <w:tc>
+          <w:tcPr>
+            <w:tcW w:type="dxa" w:w="2880"/>
+          </w:tcPr>
+          <w:p>
+            <w:r>
+              <w:t>角色</w:t>
+            </w:r>
+          </w:p>
+        </w:tc>
+        <w:tc>
+          <w:tcPr>
+            <w:tcW w:type="dxa" w:w="2880"/>
+          </w:tcPr>
+          <w:p>
+            <w:r>
+              <w:t>成员</w:t>
+            </w:r>
+          </w:p>
+        </w:tc>
+        <w:tc>
+          <w:tcPr>
+            <w:tcW w:type="dxa" w:w="2880"/>
+          </w:tcPr>
+          <w:p>
+            <w:r>
+              <w:t>职责</w:t>
+            </w:r>
+          </w:p>
+        </w:tc>
+      </w:tr>
+      <w:tr>
+        <w:tc>
+          <w:tcPr>
+            <w:tcW w:type="dxa" w:w="2880"/>
+          </w:tcPr>
+          <w:p>
+            <w:r>
+              <w:t>组长/模型负责人</w:t>
+            </w:r>
+          </w:p>
+        </w:tc>
+        <w:tc>
+          <w:tcPr>
+            <w:tcW w:type="dxa" w:w="2880"/>
+          </w:tcPr>
+          <w:p>
+            <w:r>
+              <w:t>zyj</w:t>
+            </w:r>
+          </w:p>
+        </w:tc>
+        <w:tc>
+          <w:tcPr>
+            <w:tcW w:type="dxa" w:w="2880"/>
+          </w:tcPr>
+          <w:p>
+            <w:r>
+              <w:t>需求统筹、模型主线、CLI、结题材料</w:t>
+            </w:r>
+          </w:p>
+        </w:tc>
+      </w:tr>
+      <w:tr>
+        <w:tc>
+          <w:tcPr>
+            <w:tcW w:type="dxa" w:w="2880"/>
+          </w:tcPr>
+          <w:p>
+            <w:r>
+              <w:t>训练评估负责人</w:t>
+            </w:r>
+          </w:p>
+        </w:tc>
+        <w:tc>
+          <w:tcPr>
+            <w:tcW w:type="dxa" w:w="2880"/>
+          </w:tcPr>
+          <w:p>
+            <w:r>
+              <w:t>zdh</w:t>
+            </w:r>
+          </w:p>
+        </w:tc>
+        <w:tc>
+          <w:tcPr>
+            <w:tcW w:type="dxa" w:w="2880"/>
+          </w:tcPr>
+          <w:p>
+            <w:r>
+              <w:t>trainer、tester、指标、回调、测试</w:t>
+            </w:r>
+          </w:p>
+        </w:tc>
+      </w:tr>
+      <w:tr>
+        <w:tc>
+          <w:tcPr>
+            <w:tcW w:type="dxa" w:w="2880"/>
+          </w:tcPr>
+          <w:p>
+            <w:r>
+              <w:t>数据处理负责人</w:t>
+            </w:r>
+          </w:p>
+        </w:tc>
+        <w:tc>
+          <w:tcPr>
+            <w:tcW w:type="dxa" w:w="2880"/>
+          </w:tcPr>
+          <w:p>
+            <w:r>
+              <w:t>cyj</w:t>
+            </w:r>
+          </w:p>
+        </w:tc>
+        <w:tc>
+          <w:tcPr>
+            <w:tcW w:type="dxa" w:w="2880"/>
+          </w:tcPr>
+          <w:p>
+            <w:r>
+              <w:t>loader、数据集、标签、特征流水线</w:t>
+            </w:r>
+          </w:p>
+        </w:tc>
+      </w:tr>
+      <w:tr>
+        <w:tc>
+          <w:tcPr>
+            <w:tcW w:type="dxa" w:w="2880"/>
+          </w:tcPr>
+          <w:p>
+            <w:r>
+              <w:t>可视化与交付负责人</w:t>
+            </w:r>
+          </w:p>
+        </w:tc>
+        <w:tc>
+          <w:tcPr>
+            <w:tcW w:type="dxa" w:w="2880"/>
+          </w:tcPr>
+          <w:p>
+            <w:r>
+              <w:t>zy</w:t>
+            </w:r>
+          </w:p>
+        </w:tc>
+        <w:tc>
+          <w:tcPr>
+            <w:tcW w:type="dxa" w:w="2880"/>
+          </w:tcPr>
+          <w:p>
+            <w:r>
+              <w:t>图表、Notebook、测试、文档、演示</w:t>
+            </w:r>
+          </w:p>
+        </w:tc>
+      </w:tr>
+    </w:tbl>
+    <w:p>
+      <w:pPr>
+        <w:pStyle w:val="Heading2"/>
+      </w:pPr>
+      <w:r>
         <w:t>WBS</w:t>
       </w:r>
     </w:p>
@@ -602,129 +586,51 @@
       <w:tblPr>
         <w:tblStyle w:val="TableGrid"/>
         <w:tblW w:type="auto" w:w="0"/>
-        <w:jc w:val="center"/>
-        <w:tblLayout w:type="autofit"/>
         <w:tblLook w:firstColumn="1" w:firstRow="1" w:lastColumn="0" w:lastRow="0" w:noHBand="0" w:noVBand="1" w:val="04A0"/>
       </w:tblPr>
       <w:tblGrid>
-        <w:gridCol w:w="2340"/>
-        <w:gridCol w:w="2340"/>
-        <w:gridCol w:w="2340"/>
-        <w:gridCol w:w="2340"/>
+        <w:gridCol w:w="2160"/>
+        <w:gridCol w:w="2160"/>
+        <w:gridCol w:w="2160"/>
+        <w:gridCol w:w="2160"/>
       </w:tblGrid>
       <w:tr>
         <w:tc>
           <w:tcPr>
-            <w:tcW w:type="dxa" w:w="2340"/>
-            <w:shd w:fill="F2F4F7"/>
-            <w:vAlign w:val="center"/>
-            <w:tcMar>
-              <w:top w:w="80" w:type="dxa"/>
-              <w:bottom w:w="80" w:type="dxa"/>
-              <w:start w:w="120" w:type="dxa"/>
-              <w:end w:w="120" w:type="dxa"/>
-            </w:tcMar>
+            <w:tcW w:type="dxa" w:w="2160"/>
           </w:tcPr>
           <w:p>
-            <w:pPr>
-              <w:spacing w:before="0" w:after="0" w:line="264" w:lineRule="auto"/>
-              <w:jc w:val="center"/>
-            </w:pPr>
-            <w:r/>
             <w:r>
-              <w:rPr>
-                <w:rFonts w:ascii="Calibri" w:hAnsi="Calibri" w:eastAsia="Songti SC"/>
-                <w:b/>
-                <w:color w:val="000000"/>
-                <w:sz w:val="19"/>
-              </w:rPr>
               <w:t>WBS</w:t>
             </w:r>
           </w:p>
         </w:tc>
         <w:tc>
           <w:tcPr>
-            <w:tcW w:type="dxa" w:w="2340"/>
-            <w:shd w:fill="F2F4F7"/>
-            <w:vAlign w:val="center"/>
-            <w:tcMar>
-              <w:top w:w="80" w:type="dxa"/>
-              <w:bottom w:w="80" w:type="dxa"/>
-              <w:start w:w="120" w:type="dxa"/>
-              <w:end w:w="120" w:type="dxa"/>
-            </w:tcMar>
+            <w:tcW w:type="dxa" w:w="2160"/>
           </w:tcPr>
           <w:p>
-            <w:pPr>
-              <w:spacing w:before="0" w:after="0" w:line="264" w:lineRule="auto"/>
-              <w:jc w:val="center"/>
-            </w:pPr>
-            <w:r/>
             <w:r>
-              <w:rPr>
-                <w:rFonts w:ascii="Calibri" w:hAnsi="Calibri" w:eastAsia="Songti SC"/>
-                <w:b/>
-                <w:color w:val="000000"/>
-                <w:sz w:val="19"/>
-              </w:rPr>
               <w:t>工作包</w:t>
             </w:r>
           </w:p>
         </w:tc>
         <w:tc>
           <w:tcPr>
-            <w:tcW w:type="dxa" w:w="2340"/>
-            <w:shd w:fill="F2F4F7"/>
-            <w:vAlign w:val="center"/>
-            <w:tcMar>
-              <w:top w:w="80" w:type="dxa"/>
-              <w:bottom w:w="80" w:type="dxa"/>
-              <w:start w:w="120" w:type="dxa"/>
-              <w:end w:w="120" w:type="dxa"/>
-            </w:tcMar>
+            <w:tcW w:type="dxa" w:w="2160"/>
           </w:tcPr>
           <w:p>
-            <w:pPr>
-              <w:spacing w:before="0" w:after="0" w:line="264" w:lineRule="auto"/>
-              <w:jc w:val="center"/>
-            </w:pPr>
-            <w:r/>
             <w:r>
-              <w:rPr>
-                <w:rFonts w:ascii="Calibri" w:hAnsi="Calibri" w:eastAsia="Songti SC"/>
-                <w:b/>
-                <w:color w:val="000000"/>
-                <w:sz w:val="19"/>
-              </w:rPr>
               <w:t>负责人</w:t>
             </w:r>
           </w:p>
         </w:tc>
         <w:tc>
           <w:tcPr>
-            <w:tcW w:type="dxa" w:w="2340"/>
-            <w:shd w:fill="F2F4F7"/>
-            <w:vAlign w:val="center"/>
-            <w:tcMar>
-              <w:top w:w="80" w:type="dxa"/>
-              <w:bottom w:w="80" w:type="dxa"/>
-              <w:start w:w="120" w:type="dxa"/>
-              <w:end w:w="120" w:type="dxa"/>
-            </w:tcMar>
+            <w:tcW w:type="dxa" w:w="2160"/>
           </w:tcPr>
           <w:p>
-            <w:pPr>
-              <w:spacing w:before="0" w:after="0" w:line="264" w:lineRule="auto"/>
-              <w:jc w:val="center"/>
-            </w:pPr>
-            <w:r/>
             <w:r>
-              <w:rPr>
-                <w:rFonts w:ascii="Calibri" w:hAnsi="Calibri" w:eastAsia="Songti SC"/>
-                <w:b/>
-                <w:color w:val="000000"/>
-                <w:sz w:val="19"/>
-              </w:rPr>
               <w:t>主要产出</w:t>
             </w:r>
           </w:p>
@@ -733,113 +639,41 @@
       <w:tr>
         <w:tc>
           <w:tcPr>
-            <w:tcW w:type="dxa" w:w="2340"/>
-            <w:vAlign w:val="center"/>
-            <w:tcMar>
-              <w:top w:w="80" w:type="dxa"/>
-              <w:bottom w:w="80" w:type="dxa"/>
-              <w:start w:w="120" w:type="dxa"/>
-              <w:end w:w="120" w:type="dxa"/>
-            </w:tcMar>
+            <w:tcW w:type="dxa" w:w="2160"/>
           </w:tcPr>
           <w:p>
-            <w:pPr>
-              <w:spacing w:before="0" w:after="0" w:line="264" w:lineRule="auto"/>
-              <w:jc w:val="center"/>
-            </w:pPr>
-            <w:r/>
             <w:r>
-              <w:rPr>
-                <w:rFonts w:ascii="Calibri" w:hAnsi="Calibri" w:eastAsia="Songti SC"/>
-                <w:b w:val="0"/>
-                <w:color w:val="000000"/>
-                <w:sz w:val="19"/>
-              </w:rPr>
               <w:t>1.1</w:t>
             </w:r>
           </w:p>
         </w:tc>
         <w:tc>
           <w:tcPr>
-            <w:tcW w:type="dxa" w:w="2340"/>
-            <w:vAlign w:val="center"/>
-            <w:tcMar>
-              <w:top w:w="80" w:type="dxa"/>
-              <w:bottom w:w="80" w:type="dxa"/>
-              <w:start w:w="120" w:type="dxa"/>
-              <w:end w:w="120" w:type="dxa"/>
-            </w:tcMar>
+            <w:tcW w:type="dxa" w:w="2160"/>
           </w:tcPr>
           <w:p>
-            <w:pPr>
-              <w:spacing w:before="0" w:after="0" w:line="264" w:lineRule="auto"/>
-              <w:jc w:val="center"/>
-            </w:pPr>
-            <w:r/>
             <w:r>
-              <w:rPr>
-                <w:rFonts w:ascii="Calibri" w:hAnsi="Calibri" w:eastAsia="Songti SC"/>
-                <w:b w:val="0"/>
-                <w:color w:val="000000"/>
-                <w:sz w:val="19"/>
-              </w:rPr>
-              <w:t>数据接入与标签</w:t>
+              <w:t>需求与 SRS</w:t>
             </w:r>
           </w:p>
         </w:tc>
         <w:tc>
           <w:tcPr>
-            <w:tcW w:type="dxa" w:w="2340"/>
-            <w:vAlign w:val="center"/>
-            <w:tcMar>
-              <w:top w:w="80" w:type="dxa"/>
-              <w:bottom w:w="80" w:type="dxa"/>
-              <w:start w:w="120" w:type="dxa"/>
-              <w:end w:w="120" w:type="dxa"/>
-            </w:tcMar>
+            <w:tcW w:type="dxa" w:w="2160"/>
           </w:tcPr>
           <w:p>
-            <w:pPr>
-              <w:spacing w:before="0" w:after="0" w:line="264" w:lineRule="auto"/>
-              <w:jc w:val="center"/>
-            </w:pPr>
-            <w:r/>
             <w:r>
-              <w:rPr>
-                <w:rFonts w:ascii="Calibri" w:hAnsi="Calibri" w:eastAsia="Songti SC"/>
-                <w:b w:val="0"/>
-                <w:color w:val="000000"/>
-                <w:sz w:val="19"/>
-              </w:rPr>
-              <w:t>cyj</w:t>
+              <w:t>zyj</w:t>
             </w:r>
           </w:p>
         </w:tc>
         <w:tc>
           <w:tcPr>
-            <w:tcW w:type="dxa" w:w="2340"/>
-            <w:vAlign w:val="center"/>
-            <w:tcMar>
-              <w:top w:w="80" w:type="dxa"/>
-              <w:bottom w:w="80" w:type="dxa"/>
-              <w:start w:w="120" w:type="dxa"/>
-              <w:end w:w="120" w:type="dxa"/>
-            </w:tcMar>
+            <w:tcW w:type="dxa" w:w="2160"/>
           </w:tcPr>
           <w:p>
-            <w:pPr>
-              <w:spacing w:before="0" w:after="0" w:line="264" w:lineRule="auto"/>
-              <w:jc w:val="left"/>
-            </w:pPr>
-            <w:r/>
             <w:r>
-              <w:rPr>
-                <w:rFonts w:ascii="Calibri" w:hAnsi="Calibri" w:eastAsia="Songti SC"/>
-                <w:b w:val="0"/>
-                <w:color w:val="000000"/>
-                <w:sz w:val="19"/>
-              </w:rPr>
-              <w:t>PHM2012/XJTU Loader、标签构造</w:t>
+              <w:t>需求定义、SRS、验收口径</w:t>
             </w:r>
           </w:p>
         </w:tc>
@@ -847,113 +681,41 @@
       <w:tr>
         <w:tc>
           <w:tcPr>
-            <w:tcW w:type="dxa" w:w="2340"/>
-            <w:vAlign w:val="center"/>
-            <w:tcMar>
-              <w:top w:w="80" w:type="dxa"/>
-              <w:bottom w:w="80" w:type="dxa"/>
-              <w:start w:w="120" w:type="dxa"/>
-              <w:end w:w="120" w:type="dxa"/>
-            </w:tcMar>
+            <w:tcW w:type="dxa" w:w="2160"/>
           </w:tcPr>
           <w:p>
-            <w:pPr>
-              <w:spacing w:before="0" w:after="0" w:line="264" w:lineRule="auto"/>
-              <w:jc w:val="center"/>
-            </w:pPr>
-            <w:r/>
             <w:r>
-              <w:rPr>
-                <w:rFonts w:ascii="Calibri" w:hAnsi="Calibri" w:eastAsia="Songti SC"/>
-                <w:b w:val="0"/>
-                <w:color w:val="000000"/>
-                <w:sz w:val="19"/>
-              </w:rPr>
               <w:t>1.2</w:t>
             </w:r>
           </w:p>
         </w:tc>
         <w:tc>
           <w:tcPr>
-            <w:tcW w:type="dxa" w:w="2340"/>
-            <w:vAlign w:val="center"/>
-            <w:tcMar>
-              <w:top w:w="80" w:type="dxa"/>
-              <w:bottom w:w="80" w:type="dxa"/>
-              <w:start w:w="120" w:type="dxa"/>
-              <w:end w:w="120" w:type="dxa"/>
-            </w:tcMar>
+            <w:tcW w:type="dxa" w:w="2160"/>
           </w:tcPr>
           <w:p>
-            <w:pPr>
-              <w:spacing w:before="0" w:after="0" w:line="264" w:lineRule="auto"/>
-              <w:jc w:val="center"/>
-            </w:pPr>
-            <w:r/>
             <w:r>
-              <w:rPr>
-                <w:rFonts w:ascii="Calibri" w:hAnsi="Calibri" w:eastAsia="Songti SC"/>
-                <w:b w:val="0"/>
-                <w:color w:val="000000"/>
-                <w:sz w:val="19"/>
-              </w:rPr>
-              <w:t>特征工程</w:t>
+              <w:t>数据接入与索引</w:t>
             </w:r>
           </w:p>
         </w:tc>
         <w:tc>
           <w:tcPr>
-            <w:tcW w:type="dxa" w:w="2340"/>
-            <w:vAlign w:val="center"/>
-            <w:tcMar>
-              <w:top w:w="80" w:type="dxa"/>
-              <w:bottom w:w="80" w:type="dxa"/>
-              <w:start w:w="120" w:type="dxa"/>
-              <w:end w:w="120" w:type="dxa"/>
-            </w:tcMar>
+            <w:tcW w:type="dxa" w:w="2160"/>
           </w:tcPr>
           <w:p>
-            <w:pPr>
-              <w:spacing w:before="0" w:after="0" w:line="264" w:lineRule="auto"/>
-              <w:jc w:val="center"/>
-            </w:pPr>
-            <w:r/>
             <w:r>
-              <w:rPr>
-                <w:rFonts w:ascii="Calibri" w:hAnsi="Calibri" w:eastAsia="Songti SC"/>
-                <w:b w:val="0"/>
-                <w:color w:val="000000"/>
-                <w:sz w:val="19"/>
-              </w:rPr>
-              <w:t>cyj、zy</w:t>
+              <w:t>cyj</w:t>
             </w:r>
           </w:p>
         </w:tc>
         <w:tc>
           <w:tcPr>
-            <w:tcW w:type="dxa" w:w="2340"/>
-            <w:vAlign w:val="center"/>
-            <w:tcMar>
-              <w:top w:w="80" w:type="dxa"/>
-              <w:bottom w:w="80" w:type="dxa"/>
-              <w:start w:w="120" w:type="dxa"/>
-              <w:end w:w="120" w:type="dxa"/>
-            </w:tcMar>
+            <w:tcW w:type="dxa" w:w="2160"/>
           </w:tcPr>
           <w:p>
-            <w:pPr>
-              <w:spacing w:before="0" w:after="0" w:line="264" w:lineRule="auto"/>
-              <w:jc w:val="center"/>
-            </w:pPr>
-            <w:r/>
             <w:r>
-              <w:rPr>
-                <w:rFonts w:ascii="Calibri" w:hAnsi="Calibri" w:eastAsia="Songti SC"/>
-                <w:b w:val="0"/>
-                <w:color w:val="000000"/>
-                <w:sz w:val="19"/>
-              </w:rPr>
-              <w:t>FFT、时域、频域、频带能量处理</w:t>
+              <w:t>PHM2012/XJTU loader、sample index</w:t>
             </w:r>
           </w:p>
         </w:tc>
@@ -961,113 +723,41 @@
       <w:tr>
         <w:tc>
           <w:tcPr>
-            <w:tcW w:type="dxa" w:w="2340"/>
-            <w:vAlign w:val="center"/>
-            <w:tcMar>
-              <w:top w:w="80" w:type="dxa"/>
-              <w:bottom w:w="80" w:type="dxa"/>
-              <w:start w:w="120" w:type="dxa"/>
-              <w:end w:w="120" w:type="dxa"/>
-            </w:tcMar>
+            <w:tcW w:type="dxa" w:w="2160"/>
           </w:tcPr>
           <w:p>
-            <w:pPr>
-              <w:spacing w:before="0" w:after="0" w:line="264" w:lineRule="auto"/>
-              <w:jc w:val="center"/>
-            </w:pPr>
-            <w:r/>
             <w:r>
-              <w:rPr>
-                <w:rFonts w:ascii="Calibri" w:hAnsi="Calibri" w:eastAsia="Songti SC"/>
-                <w:b w:val="0"/>
-                <w:color w:val="000000"/>
-                <w:sz w:val="19"/>
-              </w:rPr>
               <w:t>1.3</w:t>
             </w:r>
           </w:p>
         </w:tc>
         <w:tc>
           <w:tcPr>
-            <w:tcW w:type="dxa" w:w="2340"/>
-            <w:vAlign w:val="center"/>
-            <w:tcMar>
-              <w:top w:w="80" w:type="dxa"/>
-              <w:bottom w:w="80" w:type="dxa"/>
-              <w:start w:w="120" w:type="dxa"/>
-              <w:end w:w="120" w:type="dxa"/>
-            </w:tcMar>
+            <w:tcW w:type="dxa" w:w="2160"/>
           </w:tcPr>
           <w:p>
-            <w:pPr>
-              <w:spacing w:before="0" w:after="0" w:line="264" w:lineRule="auto"/>
-              <w:jc w:val="center"/>
-            </w:pPr>
-            <w:r/>
             <w:r>
-              <w:rPr>
-                <w:rFonts w:ascii="Calibri" w:hAnsi="Calibri" w:eastAsia="Songti SC"/>
-                <w:b w:val="0"/>
-                <w:color w:val="000000"/>
-                <w:sz w:val="19"/>
-              </w:rPr>
-              <w:t>模型实现</w:t>
+              <w:t>特征与标签</w:t>
             </w:r>
           </w:p>
         </w:tc>
         <w:tc>
           <w:tcPr>
-            <w:tcW w:type="dxa" w:w="2340"/>
-            <w:vAlign w:val="center"/>
-            <w:tcMar>
-              <w:top w:w="80" w:type="dxa"/>
-              <w:bottom w:w="80" w:type="dxa"/>
-              <w:start w:w="120" w:type="dxa"/>
-              <w:end w:w="120" w:type="dxa"/>
-            </w:tcMar>
+            <w:tcW w:type="dxa" w:w="2160"/>
           </w:tcPr>
           <w:p>
-            <w:pPr>
-              <w:spacing w:before="0" w:after="0" w:line="264" w:lineRule="auto"/>
-              <w:jc w:val="center"/>
-            </w:pPr>
-            <w:r/>
             <w:r>
-              <w:rPr>
-                <w:rFonts w:ascii="Calibri" w:hAnsi="Calibri" w:eastAsia="Songti SC"/>
-                <w:b w:val="0"/>
-                <w:color w:val="000000"/>
-                <w:sz w:val="19"/>
-              </w:rPr>
-              <w:t>zyj</w:t>
+              <w:t>cyj、zy</w:t>
             </w:r>
           </w:p>
         </w:tc>
         <w:tc>
           <w:tcPr>
-            <w:tcW w:type="dxa" w:w="2340"/>
-            <w:vAlign w:val="center"/>
-            <w:tcMar>
-              <w:top w:w="80" w:type="dxa"/>
-              <w:bottom w:w="80" w:type="dxa"/>
-              <w:start w:w="120" w:type="dxa"/>
-              <w:end w:w="120" w:type="dxa"/>
-            </w:tcMar>
+            <w:tcW w:type="dxa" w:w="2160"/>
           </w:tcPr>
           <w:p>
-            <w:pPr>
-              <w:spacing w:before="0" w:after="0" w:line="264" w:lineRule="auto"/>
-              <w:jc w:val="left"/>
-            </w:pPr>
-            <w:r/>
             <w:r>
-              <w:rPr>
-                <w:rFonts w:ascii="Calibri" w:hAnsi="Calibri" w:eastAsia="Songti SC"/>
-                <w:b w:val="0"/>
-                <w:color w:val="000000"/>
-                <w:sz w:val="19"/>
-              </w:rPr>
-              <w:t>CBAM-CNN-LSTM、ResCNN-LSTM</w:t>
+              <w:t>manual/tsfresh 特征、RUL/故障标签</w:t>
             </w:r>
           </w:p>
         </w:tc>
@@ -1075,113 +765,41 @@
       <w:tr>
         <w:tc>
           <w:tcPr>
-            <w:tcW w:type="dxa" w:w="2340"/>
-            <w:vAlign w:val="center"/>
-            <w:tcMar>
-              <w:top w:w="80" w:type="dxa"/>
-              <w:bottom w:w="80" w:type="dxa"/>
-              <w:start w:w="120" w:type="dxa"/>
-              <w:end w:w="120" w:type="dxa"/>
-            </w:tcMar>
+            <w:tcW w:type="dxa" w:w="2160"/>
           </w:tcPr>
           <w:p>
-            <w:pPr>
-              <w:spacing w:before="0" w:after="0" w:line="264" w:lineRule="auto"/>
-              <w:jc w:val="center"/>
-            </w:pPr>
-            <w:r/>
             <w:r>
-              <w:rPr>
-                <w:rFonts w:ascii="Calibri" w:hAnsi="Calibri" w:eastAsia="Songti SC"/>
-                <w:b w:val="0"/>
-                <w:color w:val="000000"/>
-                <w:sz w:val="19"/>
-              </w:rPr>
               <w:t>1.4</w:t>
             </w:r>
           </w:p>
         </w:tc>
         <w:tc>
           <w:tcPr>
-            <w:tcW w:type="dxa" w:w="2340"/>
-            <w:vAlign w:val="center"/>
-            <w:tcMar>
-              <w:top w:w="80" w:type="dxa"/>
-              <w:bottom w:w="80" w:type="dxa"/>
-              <w:start w:w="120" w:type="dxa"/>
-              <w:end w:w="120" w:type="dxa"/>
-            </w:tcMar>
+            <w:tcW w:type="dxa" w:w="2160"/>
           </w:tcPr>
           <w:p>
-            <w:pPr>
-              <w:spacing w:before="0" w:after="0" w:line="264" w:lineRule="auto"/>
-              <w:jc w:val="center"/>
-            </w:pPr>
-            <w:r/>
             <w:r>
-              <w:rPr>
-                <w:rFonts w:ascii="Calibri" w:hAnsi="Calibri" w:eastAsia="Songti SC"/>
-                <w:b w:val="0"/>
-                <w:color w:val="000000"/>
-                <w:sz w:val="19"/>
-              </w:rPr>
-              <w:t>训练与评估</w:t>
+              <w:t>模型与训练</w:t>
             </w:r>
           </w:p>
         </w:tc>
         <w:tc>
           <w:tcPr>
-            <w:tcW w:type="dxa" w:w="2340"/>
-            <w:vAlign w:val="center"/>
-            <w:tcMar>
-              <w:top w:w="80" w:type="dxa"/>
-              <w:bottom w:w="80" w:type="dxa"/>
-              <w:start w:w="120" w:type="dxa"/>
-              <w:end w:w="120" w:type="dxa"/>
-            </w:tcMar>
+            <w:tcW w:type="dxa" w:w="2160"/>
           </w:tcPr>
           <w:p>
-            <w:pPr>
-              <w:spacing w:before="0" w:after="0" w:line="264" w:lineRule="auto"/>
-              <w:jc w:val="center"/>
-            </w:pPr>
-            <w:r/>
             <w:r>
-              <w:rPr>
-                <w:rFonts w:ascii="Calibri" w:hAnsi="Calibri" w:eastAsia="Songti SC"/>
-                <w:b w:val="0"/>
-                <w:color w:val="000000"/>
-                <w:sz w:val="19"/>
-              </w:rPr>
-              <w:t>zdh</w:t>
+              <w:t>zyj、zdh</w:t>
             </w:r>
           </w:p>
         </w:tc>
         <w:tc>
           <w:tcPr>
-            <w:tcW w:type="dxa" w:w="2340"/>
-            <w:vAlign w:val="center"/>
-            <w:tcMar>
-              <w:top w:w="80" w:type="dxa"/>
-              <w:bottom w:w="80" w:type="dxa"/>
-              <w:start w:w="120" w:type="dxa"/>
-              <w:end w:w="120" w:type="dxa"/>
-            </w:tcMar>
+            <w:tcW w:type="dxa" w:w="2160"/>
           </w:tcPr>
           <w:p>
-            <w:pPr>
-              <w:spacing w:before="0" w:after="0" w:line="264" w:lineRule="auto"/>
-              <w:jc w:val="left"/>
-            </w:pPr>
-            <w:r/>
             <w:r>
-              <w:rPr>
-                <w:rFonts w:ascii="Calibri" w:hAnsi="Calibri" w:eastAsia="Songti SC"/>
-                <w:b w:val="0"/>
-                <w:color w:val="000000"/>
-                <w:sz w:val="19"/>
-              </w:rPr>
-              <w:t>Trainer、Tester、指标与回调</w:t>
+              <w:t>MLP/CNN/GRU/LSTM、trainer、callback</w:t>
             </w:r>
           </w:p>
         </w:tc>
@@ -1189,113 +807,41 @@
       <w:tr>
         <w:tc>
           <w:tcPr>
-            <w:tcW w:type="dxa" w:w="2340"/>
-            <w:vAlign w:val="center"/>
-            <w:tcMar>
-              <w:top w:w="80" w:type="dxa"/>
-              <w:bottom w:w="80" w:type="dxa"/>
-              <w:start w:w="120" w:type="dxa"/>
-              <w:end w:w="120" w:type="dxa"/>
-            </w:tcMar>
+            <w:tcW w:type="dxa" w:w="2160"/>
           </w:tcPr>
           <w:p>
-            <w:pPr>
-              <w:spacing w:before="0" w:after="0" w:line="264" w:lineRule="auto"/>
-              <w:jc w:val="center"/>
-            </w:pPr>
-            <w:r/>
             <w:r>
-              <w:rPr>
-                <w:rFonts w:ascii="Calibri" w:hAnsi="Calibri" w:eastAsia="Songti SC"/>
-                <w:b w:val="0"/>
-                <w:color w:val="000000"/>
-                <w:sz w:val="19"/>
-              </w:rPr>
               <w:t>1.5</w:t>
             </w:r>
           </w:p>
         </w:tc>
         <w:tc>
           <w:tcPr>
-            <w:tcW w:type="dxa" w:w="2340"/>
-            <w:vAlign w:val="center"/>
-            <w:tcMar>
-              <w:top w:w="80" w:type="dxa"/>
-              <w:bottom w:w="80" w:type="dxa"/>
-              <w:start w:w="120" w:type="dxa"/>
-              <w:end w:w="120" w:type="dxa"/>
-            </w:tcMar>
+            <w:tcW w:type="dxa" w:w="2160"/>
           </w:tcPr>
           <w:p>
-            <w:pPr>
-              <w:spacing w:before="0" w:after="0" w:line="264" w:lineRule="auto"/>
-              <w:jc w:val="center"/>
-            </w:pPr>
-            <w:r/>
             <w:r>
-              <w:rPr>
-                <w:rFonts w:ascii="Calibri" w:hAnsi="Calibri" w:eastAsia="Songti SC"/>
-                <w:b w:val="0"/>
-                <w:color w:val="000000"/>
-                <w:sz w:val="19"/>
-              </w:rPr>
-              <w:t>示例与可视化</w:t>
+              <w:t>评估与报告</w:t>
             </w:r>
           </w:p>
         </w:tc>
         <w:tc>
           <w:tcPr>
-            <w:tcW w:type="dxa" w:w="2340"/>
-            <w:vAlign w:val="center"/>
-            <w:tcMar>
-              <w:top w:w="80" w:type="dxa"/>
-              <w:bottom w:w="80" w:type="dxa"/>
-              <w:start w:w="120" w:type="dxa"/>
-              <w:end w:w="120" w:type="dxa"/>
-            </w:tcMar>
+            <w:tcW w:type="dxa" w:w="2160"/>
           </w:tcPr>
           <w:p>
-            <w:pPr>
-              <w:spacing w:before="0" w:after="0" w:line="264" w:lineRule="auto"/>
-              <w:jc w:val="center"/>
-            </w:pPr>
-            <w:r/>
             <w:r>
-              <w:rPr>
-                <w:rFonts w:ascii="Calibri" w:hAnsi="Calibri" w:eastAsia="Songti SC"/>
-                <w:b w:val="0"/>
-                <w:color w:val="000000"/>
-                <w:sz w:val="19"/>
-              </w:rPr>
-              <w:t>zy</w:t>
+              <w:t>zdh、zy</w:t>
             </w:r>
           </w:p>
         </w:tc>
         <w:tc>
           <w:tcPr>
-            <w:tcW w:type="dxa" w:w="2340"/>
-            <w:vAlign w:val="center"/>
-            <w:tcMar>
-              <w:top w:w="80" w:type="dxa"/>
-              <w:bottom w:w="80" w:type="dxa"/>
-              <w:start w:w="120" w:type="dxa"/>
-              <w:end w:w="120" w:type="dxa"/>
-            </w:tcMar>
+            <w:tcW w:type="dxa" w:w="2160"/>
           </w:tcPr>
           <w:p>
-            <w:pPr>
-              <w:spacing w:before="0" w:after="0" w:line="264" w:lineRule="auto"/>
-              <w:jc w:val="center"/>
-            </w:pPr>
-            <w:r/>
             <w:r>
-              <w:rPr>
-                <w:rFonts w:ascii="Calibri" w:hAnsi="Calibri" w:eastAsia="Songti SC"/>
-                <w:b w:val="0"/>
-                <w:color w:val="000000"/>
-                <w:sz w:val="19"/>
-              </w:rPr>
-              <w:t>Notebook、图表、热力图</w:t>
+              <w:t>metrics、prediction audit、图表</w:t>
             </w:r>
           </w:p>
         </w:tc>
@@ -1303,113 +849,41 @@
       <w:tr>
         <w:tc>
           <w:tcPr>
-            <w:tcW w:type="dxa" w:w="2340"/>
-            <w:vAlign w:val="center"/>
-            <w:tcMar>
-              <w:top w:w="80" w:type="dxa"/>
-              <w:bottom w:w="80" w:type="dxa"/>
-              <w:start w:w="120" w:type="dxa"/>
-              <w:end w:w="120" w:type="dxa"/>
-            </w:tcMar>
+            <w:tcW w:type="dxa" w:w="2160"/>
           </w:tcPr>
           <w:p>
-            <w:pPr>
-              <w:spacing w:before="0" w:after="0" w:line="264" w:lineRule="auto"/>
-              <w:jc w:val="center"/>
-            </w:pPr>
-            <w:r/>
             <w:r>
-              <w:rPr>
-                <w:rFonts w:ascii="Calibri" w:hAnsi="Calibri" w:eastAsia="Songti SC"/>
-                <w:b w:val="0"/>
-                <w:color w:val="000000"/>
-                <w:sz w:val="19"/>
-              </w:rPr>
               <w:t>1.6</w:t>
             </w:r>
           </w:p>
         </w:tc>
         <w:tc>
           <w:tcPr>
-            <w:tcW w:type="dxa" w:w="2340"/>
-            <w:vAlign w:val="center"/>
-            <w:tcMar>
-              <w:top w:w="80" w:type="dxa"/>
-              <w:bottom w:w="80" w:type="dxa"/>
-              <w:start w:w="120" w:type="dxa"/>
-              <w:end w:w="120" w:type="dxa"/>
-            </w:tcMar>
+            <w:tcW w:type="dxa" w:w="2160"/>
           </w:tcPr>
           <w:p>
-            <w:pPr>
-              <w:spacing w:before="0" w:after="0" w:line="264" w:lineRule="auto"/>
-              <w:jc w:val="center"/>
-            </w:pPr>
-            <w:r/>
             <w:r>
-              <w:rPr>
-                <w:rFonts w:ascii="Calibri" w:hAnsi="Calibri" w:eastAsia="Songti SC"/>
-                <w:b w:val="0"/>
-                <w:color w:val="000000"/>
-                <w:sz w:val="19"/>
-              </w:rPr>
-              <w:t>文档与答辩</w:t>
+              <w:t>演示与文档</w:t>
             </w:r>
           </w:p>
         </w:tc>
         <w:tc>
           <w:tcPr>
-            <w:tcW w:type="dxa" w:w="2340"/>
-            <w:vAlign w:val="center"/>
-            <w:tcMar>
-              <w:top w:w="80" w:type="dxa"/>
-              <w:bottom w:w="80" w:type="dxa"/>
-              <w:start w:w="120" w:type="dxa"/>
-              <w:end w:w="120" w:type="dxa"/>
-            </w:tcMar>
+            <w:tcW w:type="dxa" w:w="2160"/>
           </w:tcPr>
           <w:p>
-            <w:pPr>
-              <w:spacing w:before="0" w:after="0" w:line="264" w:lineRule="auto"/>
-              <w:jc w:val="center"/>
-            </w:pPr>
-            <w:r/>
             <w:r>
-              <w:rPr>
-                <w:rFonts w:ascii="Calibri" w:hAnsi="Calibri" w:eastAsia="Songti SC"/>
-                <w:b w:val="0"/>
-                <w:color w:val="000000"/>
-                <w:sz w:val="19"/>
-              </w:rPr>
               <w:t>全员</w:t>
             </w:r>
           </w:p>
         </w:tc>
         <w:tc>
           <w:tcPr>
-            <w:tcW w:type="dxa" w:w="2340"/>
-            <w:vAlign w:val="center"/>
-            <w:tcMar>
-              <w:top w:w="80" w:type="dxa"/>
-              <w:bottom w:w="80" w:type="dxa"/>
-              <w:start w:w="120" w:type="dxa"/>
-              <w:end w:w="120" w:type="dxa"/>
-            </w:tcMar>
+            <w:tcW w:type="dxa" w:w="2160"/>
           </w:tcPr>
           <w:p>
-            <w:pPr>
-              <w:spacing w:before="0" w:after="0" w:line="264" w:lineRule="auto"/>
-              <w:jc w:val="center"/>
-            </w:pPr>
-            <w:r/>
             <w:r>
-              <w:rPr>
-                <w:rFonts w:ascii="Calibri" w:hAnsi="Calibri" w:eastAsia="Songti SC"/>
-                <w:b w:val="0"/>
-                <w:color w:val="000000"/>
-                <w:sz w:val="19"/>
-              </w:rPr>
-              <w:t>课程文档、技术论文、贡献说明</w:t>
+              <w:t>PPT、视频、用户手册、测试报告</w:t>
             </w:r>
           </w:p>
         </w:tc>
@@ -1417,121 +891,62 @@
     </w:tbl>
     <w:p>
       <w:pPr>
-        <w:spacing w:before="0" w:after="120" w:line="264" w:lineRule="auto"/>
-      </w:pPr>
-    </w:p>
-    <w:p>
-      <w:pPr>
-        <w:spacing w:before="320" w:after="160" w:line="264" w:lineRule="auto"/>
+        <w:pStyle w:val="Heading2"/>
       </w:pPr>
       <w:r>
-        <w:rPr>
-          <w:rFonts w:ascii="Calibri" w:hAnsi="Calibri" w:eastAsia="Songti SC"/>
-          <w:b/>
-          <w:color w:val="2E74B5"/>
-          <w:sz w:val="32"/>
-        </w:rPr>
-        <w:t>进度计划</w:t>
+        <w:t>半月进度表</w:t>
       </w:r>
     </w:p>
     <w:tbl>
       <w:tblPr>
         <w:tblStyle w:val="TableGrid"/>
         <w:tblW w:type="auto" w:w="0"/>
-        <w:jc w:val="center"/>
-        <w:tblLayout w:type="autofit"/>
         <w:tblLook w:firstColumn="1" w:firstRow="1" w:lastColumn="0" w:lastRow="0" w:noHBand="0" w:noVBand="1" w:val="04A0"/>
       </w:tblPr>
       <w:tblGrid>
-        <w:gridCol w:w="3120"/>
-        <w:gridCol w:w="3120"/>
-        <w:gridCol w:w="3120"/>
+        <w:gridCol w:w="2160"/>
+        <w:gridCol w:w="2160"/>
+        <w:gridCol w:w="2160"/>
+        <w:gridCol w:w="2160"/>
       </w:tblGrid>
       <w:tr>
         <w:tc>
           <w:tcPr>
-            <w:tcW w:type="dxa" w:w="3120"/>
-            <w:shd w:fill="F2F4F7"/>
-            <w:vAlign w:val="center"/>
-            <w:tcMar>
-              <w:top w:w="80" w:type="dxa"/>
-              <w:bottom w:w="80" w:type="dxa"/>
-              <w:start w:w="120" w:type="dxa"/>
-              <w:end w:w="120" w:type="dxa"/>
-            </w:tcMar>
+            <w:tcW w:type="dxa" w:w="2160"/>
           </w:tcPr>
           <w:p>
-            <w:pPr>
-              <w:spacing w:before="0" w:after="0" w:line="264" w:lineRule="auto"/>
-              <w:jc w:val="center"/>
-            </w:pPr>
-            <w:r/>
             <w:r>
-              <w:rPr>
-                <w:rFonts w:ascii="Calibri" w:hAnsi="Calibri" w:eastAsia="Songti SC"/>
-                <w:b/>
-                <w:color w:val="000000"/>
-                <w:sz w:val="19"/>
-              </w:rPr>
-              <w:t>阶段</w:t>
-            </w:r>
-          </w:p>
-        </w:tc>
-        <w:tc>
-          <w:tcPr>
-            <w:tcW w:type="dxa" w:w="3120"/>
-            <w:shd w:fill="F2F4F7"/>
-            <w:vAlign w:val="center"/>
-            <w:tcMar>
-              <w:top w:w="80" w:type="dxa"/>
-              <w:bottom w:w="80" w:type="dxa"/>
-              <w:start w:w="120" w:type="dxa"/>
-              <w:end w:w="120" w:type="dxa"/>
-            </w:tcMar>
-          </w:tcPr>
-          <w:p>
-            <w:pPr>
-              <w:spacing w:before="0" w:after="0" w:line="264" w:lineRule="auto"/>
-              <w:jc w:val="center"/>
-            </w:pPr>
-            <w:r/>
-            <w:r>
-              <w:rPr>
-                <w:rFonts w:ascii="Calibri" w:hAnsi="Calibri" w:eastAsia="Songti SC"/>
-                <w:b/>
-                <w:color w:val="000000"/>
-                <w:sz w:val="19"/>
-              </w:rPr>
               <w:t>时间</w:t>
             </w:r>
           </w:p>
         </w:tc>
         <w:tc>
           <w:tcPr>
-            <w:tcW w:type="dxa" w:w="3120"/>
-            <w:shd w:fill="F2F4F7"/>
-            <w:vAlign w:val="center"/>
-            <w:tcMar>
-              <w:top w:w="80" w:type="dxa"/>
-              <w:bottom w:w="80" w:type="dxa"/>
-              <w:start w:w="120" w:type="dxa"/>
-              <w:end w:w="120" w:type="dxa"/>
-            </w:tcMar>
+            <w:tcW w:type="dxa" w:w="2160"/>
           </w:tcPr>
           <w:p>
-            <w:pPr>
-              <w:spacing w:before="0" w:after="0" w:line="264" w:lineRule="auto"/>
-              <w:jc w:val="center"/>
-            </w:pPr>
-            <w:r/>
             <w:r>
-              <w:rPr>
-                <w:rFonts w:ascii="Calibri" w:hAnsi="Calibri" w:eastAsia="Songti SC"/>
-                <w:b/>
-                <w:color w:val="000000"/>
-                <w:sz w:val="19"/>
-              </w:rPr>
-              <w:t>目标</w:t>
+              <w:t>迭代目标</w:t>
+            </w:r>
+          </w:p>
+        </w:tc>
+        <w:tc>
+          <w:tcPr>
+            <w:tcW w:type="dxa" w:w="2160"/>
+          </w:tcPr>
+          <w:p>
+            <w:r>
+              <w:t>实际产出</w:t>
+            </w:r>
+          </w:p>
+        </w:tc>
+        <w:tc>
+          <w:tcPr>
+            <w:tcW w:type="dxa" w:w="2160"/>
+          </w:tcPr>
+          <w:p>
+            <w:r>
+              <w:t>风险处理</w:t>
             </w:r>
           </w:p>
         </w:tc>
@@ -1539,85 +954,41 @@
       <w:tr>
         <w:tc>
           <w:tcPr>
-            <w:tcW w:type="dxa" w:w="3120"/>
-            <w:vAlign w:val="center"/>
-            <w:tcMar>
-              <w:top w:w="80" w:type="dxa"/>
-              <w:bottom w:w="80" w:type="dxa"/>
-              <w:start w:w="120" w:type="dxa"/>
-              <w:end w:w="120" w:type="dxa"/>
-            </w:tcMar>
+            <w:tcW w:type="dxa" w:w="2160"/>
           </w:tcPr>
           <w:p>
-            <w:pPr>
-              <w:spacing w:before="0" w:after="0" w:line="264" w:lineRule="auto"/>
-              <w:jc w:val="center"/>
-            </w:pPr>
-            <w:r/>
             <w:r>
-              <w:rPr>
-                <w:rFonts w:ascii="Calibri" w:hAnsi="Calibri" w:eastAsia="Songti SC"/>
-                <w:b w:val="0"/>
-                <w:color w:val="000000"/>
-                <w:sz w:val="19"/>
-              </w:rPr>
-              <w:t>开题</w:t>
+              <w:t>2026-03 上旬</w:t>
             </w:r>
           </w:p>
         </w:tc>
         <w:tc>
           <w:tcPr>
-            <w:tcW w:type="dxa" w:w="3120"/>
-            <w:vAlign w:val="center"/>
-            <w:tcMar>
-              <w:top w:w="80" w:type="dxa"/>
-              <w:bottom w:w="80" w:type="dxa"/>
-              <w:start w:w="120" w:type="dxa"/>
-              <w:end w:w="120" w:type="dxa"/>
-            </w:tcMar>
+            <w:tcW w:type="dxa" w:w="2160"/>
           </w:tcPr>
           <w:p>
-            <w:pPr>
-              <w:spacing w:before="0" w:after="0" w:line="264" w:lineRule="auto"/>
-              <w:jc w:val="center"/>
-            </w:pPr>
-            <w:r/>
             <w:r>
-              <w:rPr>
-                <w:rFonts w:ascii="Calibri" w:hAnsi="Calibri" w:eastAsia="Songti SC"/>
-                <w:b w:val="0"/>
-                <w:color w:val="000000"/>
-                <w:sz w:val="19"/>
-              </w:rPr>
-              <w:t>第1-2周</w:t>
+              <w:t>完成选题、调研和需求框架</w:t>
             </w:r>
           </w:p>
         </w:tc>
         <w:tc>
           <w:tcPr>
-            <w:tcW w:type="dxa" w:w="3120"/>
-            <w:vAlign w:val="center"/>
-            <w:tcMar>
-              <w:top w:w="80" w:type="dxa"/>
-              <w:bottom w:w="80" w:type="dxa"/>
-              <w:start w:w="120" w:type="dxa"/>
-              <w:end w:w="120" w:type="dxa"/>
-            </w:tcMar>
+            <w:tcW w:type="dxa" w:w="2160"/>
           </w:tcPr>
           <w:p>
-            <w:pPr>
-              <w:spacing w:before="0" w:after="0" w:line="264" w:lineRule="auto"/>
-              <w:jc w:val="left"/>
-            </w:pPr>
-            <w:r/>
             <w:r>
-              <w:rPr>
-                <w:rFonts w:ascii="Calibri" w:hAnsi="Calibri" w:eastAsia="Songti SC"/>
-                <w:b w:val="0"/>
-                <w:color w:val="000000"/>
-                <w:sz w:val="19"/>
-              </w:rPr>
-              <w:t>完成需求、预研、SRS、确认测试计划和项目计划</w:t>
+              <w:t>开题报告、技术预研初稿</w:t>
+            </w:r>
+          </w:p>
+        </w:tc>
+        <w:tc>
+          <w:tcPr>
+            <w:tcW w:type="dxa" w:w="2160"/>
+          </w:tcPr>
+          <w:p>
+            <w:r>
+              <w:t>明确不提交原始大数据</w:t>
             </w:r>
           </w:p>
         </w:tc>
@@ -1625,85 +996,41 @@
       <w:tr>
         <w:tc>
           <w:tcPr>
-            <w:tcW w:type="dxa" w:w="3120"/>
-            <w:vAlign w:val="center"/>
-            <w:tcMar>
-              <w:top w:w="80" w:type="dxa"/>
-              <w:bottom w:w="80" w:type="dxa"/>
-              <w:start w:w="120" w:type="dxa"/>
-              <w:end w:w="120" w:type="dxa"/>
-            </w:tcMar>
+            <w:tcW w:type="dxa" w:w="2160"/>
           </w:tcPr>
           <w:p>
-            <w:pPr>
-              <w:spacing w:before="0" w:after="0" w:line="264" w:lineRule="auto"/>
-              <w:jc w:val="center"/>
-            </w:pPr>
-            <w:r/>
             <w:r>
-              <w:rPr>
-                <w:rFonts w:ascii="Calibri" w:hAnsi="Calibri" w:eastAsia="Songti SC"/>
-                <w:b w:val="0"/>
-                <w:color w:val="000000"/>
-                <w:sz w:val="19"/>
-              </w:rPr>
-              <w:t>中期</w:t>
+              <w:t>2026-03 下旬</w:t>
             </w:r>
           </w:p>
         </w:tc>
         <w:tc>
           <w:tcPr>
-            <w:tcW w:type="dxa" w:w="3120"/>
-            <w:vAlign w:val="center"/>
-            <w:tcMar>
-              <w:top w:w="80" w:type="dxa"/>
-              <w:bottom w:w="80" w:type="dxa"/>
-              <w:start w:w="120" w:type="dxa"/>
-              <w:end w:w="120" w:type="dxa"/>
-            </w:tcMar>
+            <w:tcW w:type="dxa" w:w="2160"/>
           </w:tcPr>
           <w:p>
-            <w:pPr>
-              <w:spacing w:before="0" w:after="0" w:line="264" w:lineRule="auto"/>
-              <w:jc w:val="center"/>
-            </w:pPr>
-            <w:r/>
             <w:r>
-              <w:rPr>
-                <w:rFonts w:ascii="Calibri" w:hAnsi="Calibri" w:eastAsia="Songti SC"/>
-                <w:b w:val="0"/>
-                <w:color w:val="000000"/>
-                <w:sz w:val="19"/>
-              </w:rPr>
-              <w:t>第3-6周</w:t>
+              <w:t>完成 SRS、项目计划、确认测试计划</w:t>
             </w:r>
           </w:p>
         </w:tc>
         <w:tc>
           <w:tcPr>
-            <w:tcW w:type="dxa" w:w="3120"/>
-            <w:vAlign w:val="center"/>
-            <w:tcMar>
-              <w:top w:w="80" w:type="dxa"/>
-              <w:bottom w:w="80" w:type="dxa"/>
-              <w:start w:w="120" w:type="dxa"/>
-              <w:end w:w="120" w:type="dxa"/>
-            </w:tcMar>
+            <w:tcW w:type="dxa" w:w="2160"/>
           </w:tcPr>
           <w:p>
-            <w:pPr>
-              <w:spacing w:before="0" w:after="0" w:line="264" w:lineRule="auto"/>
-              <w:jc w:val="left"/>
-            </w:pPr>
-            <w:r/>
             <w:r>
-              <w:rPr>
-                <w:rFonts w:ascii="Calibri" w:hAnsi="Calibri" w:eastAsia="Songti SC"/>
-                <w:b w:val="0"/>
-                <w:color w:val="000000"/>
-                <w:sz w:val="19"/>
-              </w:rPr>
-              <w:t>完成核心代码、设计文档、测试计划和编码规范</w:t>
+              <w:t>需求定义、SRS、项目管理计划</w:t>
+            </w:r>
+          </w:p>
+        </w:tc>
+        <w:tc>
+          <w:tcPr>
+            <w:tcW w:type="dxa" w:w="2160"/>
+          </w:tcPr>
+          <w:p>
+            <w:r>
+              <w:t>将数据路径抽象为 loader_roots</w:t>
             </w:r>
           </w:p>
         </w:tc>
@@ -1711,85 +1038,251 @@
       <w:tr>
         <w:tc>
           <w:tcPr>
-            <w:tcW w:type="dxa" w:w="3120"/>
-            <w:vAlign w:val="center"/>
-            <w:tcMar>
-              <w:top w:w="80" w:type="dxa"/>
-              <w:bottom w:w="80" w:type="dxa"/>
-              <w:start w:w="120" w:type="dxa"/>
-              <w:end w:w="120" w:type="dxa"/>
-            </w:tcMar>
+            <w:tcW w:type="dxa" w:w="2160"/>
           </w:tcPr>
           <w:p>
-            <w:pPr>
-              <w:spacing w:before="0" w:after="0" w:line="264" w:lineRule="auto"/>
-              <w:jc w:val="center"/>
-            </w:pPr>
-            <w:r/>
             <w:r>
-              <w:rPr>
-                <w:rFonts w:ascii="Calibri" w:hAnsi="Calibri" w:eastAsia="Songti SC"/>
-                <w:b w:val="0"/>
-                <w:color w:val="000000"/>
-                <w:sz w:val="19"/>
-              </w:rPr>
-              <w:t>结题</w:t>
+              <w:t>2026-04 上旬</w:t>
             </w:r>
           </w:p>
         </w:tc>
         <w:tc>
           <w:tcPr>
-            <w:tcW w:type="dxa" w:w="3120"/>
-            <w:vAlign w:val="center"/>
-            <w:tcMar>
-              <w:top w:w="80" w:type="dxa"/>
-              <w:bottom w:w="80" w:type="dxa"/>
-              <w:start w:w="120" w:type="dxa"/>
-              <w:end w:w="120" w:type="dxa"/>
-            </w:tcMar>
+            <w:tcW w:type="dxa" w:w="2160"/>
           </w:tcPr>
           <w:p>
-            <w:pPr>
-              <w:spacing w:before="0" w:after="0" w:line="264" w:lineRule="auto"/>
-              <w:jc w:val="center"/>
-            </w:pPr>
-            <w:r/>
             <w:r>
-              <w:rPr>
-                <w:rFonts w:ascii="Calibri" w:hAnsi="Calibri" w:eastAsia="Songti SC"/>
-                <w:b w:val="0"/>
-                <w:color w:val="000000"/>
-                <w:sz w:val="19"/>
-              </w:rPr>
-              <w:t>第7-8周</w:t>
+              <w:t>搭建 loader、index、split 和基础测试</w:t>
             </w:r>
           </w:p>
         </w:tc>
         <w:tc>
           <w:tcPr>
-            <w:tcW w:type="dxa" w:w="3120"/>
-            <w:vAlign w:val="center"/>
-            <w:tcMar>
-              <w:top w:w="80" w:type="dxa"/>
-              <w:bottom w:w="80" w:type="dxa"/>
-              <w:start w:w="120" w:type="dxa"/>
-              <w:end w:w="120" w:type="dxa"/>
-            </w:tcMar>
+            <w:tcW w:type="dxa" w:w="2160"/>
           </w:tcPr>
           <w:p>
-            <w:pPr>
-              <w:spacing w:before="0" w:after="0" w:line="264" w:lineRule="auto"/>
-              <w:jc w:val="left"/>
-            </w:pPr>
-            <w:r/>
             <w:r>
-              <w:rPr>
-                <w:rFonts w:ascii="Calibri" w:hAnsi="Calibri" w:eastAsia="Songti SC"/>
-                <w:b w:val="0"/>
-                <w:color w:val="000000"/>
-                <w:sz w:val="19"/>
-              </w:rPr>
-              <w:t>完成主线复现、测试报告、用户手册、技术论文和答辩材料</w:t>
+              <w:t>`infra/index`、split 测试</w:t>
+            </w:r>
+          </w:p>
+        </w:tc>
+        <w:tc>
+          <w:tcPr>
+            <w:tcW w:type="dxa" w:w="2160"/>
+          </w:tcPr>
+          <w:p>
+            <w:r>
+              <w:t>使用小数据 fixture 保证可测</w:t>
+            </w:r>
+          </w:p>
+        </w:tc>
+      </w:tr>
+      <w:tr>
+        <w:tc>
+          <w:tcPr>
+            <w:tcW w:type="dxa" w:w="2160"/>
+          </w:tcPr>
+          <w:p>
+            <w:r>
+              <w:t>2026-04 下旬</w:t>
+            </w:r>
+          </w:p>
+        </w:tc>
+        <w:tc>
+          <w:tcPr>
+            <w:tcW w:type="dxa" w:w="2160"/>
+          </w:tcPr>
+          <w:p>
+            <w:r>
+              <w:t>完成特征、标签、任务构造和设计文档</w:t>
+            </w:r>
+          </w:p>
+        </w:tc>
+        <w:tc>
+          <w:tcPr>
+            <w:tcW w:type="dxa" w:w="2160"/>
+          </w:tcPr>
+          <w:p>
+            <w:r>
+              <w:t>feature/label/task 模块</w:t>
+            </w:r>
+          </w:p>
+        </w:tc>
+        <w:tc>
+          <w:tcPr>
+            <w:tcW w:type="dxa" w:w="2160"/>
+          </w:tcPr>
+          <w:p>
+            <w:r>
+              <w:t>记录 label-source 风险</w:t>
+            </w:r>
+          </w:p>
+        </w:tc>
+      </w:tr>
+      <w:tr>
+        <w:tc>
+          <w:tcPr>
+            <w:tcW w:type="dxa" w:w="2160"/>
+          </w:tcPr>
+          <w:p>
+            <w:r>
+              <w:t>2026-05 上旬</w:t>
+            </w:r>
+          </w:p>
+        </w:tc>
+        <w:tc>
+          <w:tcPr>
+            <w:tcW w:type="dxa" w:w="2160"/>
+          </w:tcPr>
+          <w:p>
+            <w:r>
+              <w:t>完成 trainer、metric、model factory 和中期材料</w:t>
+            </w:r>
+          </w:p>
+        </w:tc>
+        <w:tc>
+          <w:tcPr>
+            <w:tcW w:type="dxa" w:w="2160"/>
+          </w:tcPr>
+          <w:p>
+            <w:r>
+              <w:t>中期报告、设计、UML、测试计划</w:t>
+            </w:r>
+          </w:p>
+        </w:tc>
+        <w:tc>
+          <w:tcPr>
+            <w:tcW w:type="dxa" w:w="2160"/>
+          </w:tcPr>
+          <w:p>
+            <w:r>
+              <w:t>明确核心组件代码范围</w:t>
+            </w:r>
+          </w:p>
+        </w:tc>
+      </w:tr>
+      <w:tr>
+        <w:tc>
+          <w:tcPr>
+            <w:tcW w:type="dxa" w:w="2160"/>
+          </w:tcPr>
+          <w:p>
+            <w:r>
+              <w:t>2026-05 下旬</w:t>
+            </w:r>
+          </w:p>
+        </w:tc>
+        <w:tc>
+          <w:tcPr>
+            <w:tcW w:type="dxa" w:w="2160"/>
+          </w:tcPr>
+          <w:p>
+            <w:r>
+              <w:t>跑通 MLP/GRU 主线和非深度基线</w:t>
+            </w:r>
+          </w:p>
+        </w:tc>
+        <w:tc>
+          <w:tcPr>
+            <w:tcW w:type="dxa" w:w="2160"/>
+          </w:tcPr>
+          <w:p>
+            <w:r>
+              <w:t>baseline、sequence、feature analysis 报告</w:t>
+            </w:r>
+          </w:p>
+        </w:tc>
+        <w:tc>
+          <w:tcPr>
+            <w:tcW w:type="dxa" w:w="2160"/>
+          </w:tcPr>
+          <w:p>
+            <w:r>
+              <w:t>区分 50ep demo 与 200ep 主线</w:t>
+            </w:r>
+          </w:p>
+        </w:tc>
+      </w:tr>
+      <w:tr>
+        <w:tc>
+          <w:tcPr>
+            <w:tcW w:type="dxa" w:w="2160"/>
+          </w:tcPr>
+          <w:p>
+            <w:r>
+              <w:t>2026-06 上旬</w:t>
+            </w:r>
+          </w:p>
+        </w:tc>
+        <w:tc>
+          <w:tcPr>
+            <w:tcW w:type="dxa" w:w="2160"/>
+          </w:tcPr>
+          <w:p>
+            <w:r>
+              <w:t>完成 Dashboard、训练视频、用户手册</w:t>
+            </w:r>
+          </w:p>
+        </w:tc>
+        <w:tc>
+          <w:tcPr>
+            <w:tcW w:type="dxa" w:w="2160"/>
+          </w:tcPr>
+          <w:p>
+            <w:r>
+              <w:t>demo_dashboard、demo_videos</w:t>
+            </w:r>
+          </w:p>
+        </w:tc>
+        <w:tc>
+          <w:tcPr>
+            <w:tcW w:type="dxa" w:w="2160"/>
+          </w:tcPr>
+          <w:p>
+            <w:r>
+              <w:t>manifest 和 QA 记录归档</w:t>
+            </w:r>
+          </w:p>
+        </w:tc>
+      </w:tr>
+      <w:tr>
+        <w:tc>
+          <w:tcPr>
+            <w:tcW w:type="dxa" w:w="2160"/>
+          </w:tcPr>
+          <w:p>
+            <w:r>
+              <w:t>2026-06 下旬</w:t>
+            </w:r>
+          </w:p>
+        </w:tc>
+        <w:tc>
+          <w:tcPr>
+            <w:tcW w:type="dxa" w:w="2160"/>
+          </w:tcPr>
+          <w:p>
+            <w:r>
+              <w:t>完成结题文档、论文、测试报告和交付包</w:t>
+            </w:r>
+          </w:p>
+        </w:tc>
+        <w:tc>
+          <w:tcPr>
+            <w:tcW w:type="dxa" w:w="2160"/>
+          </w:tcPr>
+          <w:p>
+            <w:r>
+              <w:t>docx、outputs、delivery zip</w:t>
+            </w:r>
+          </w:p>
+        </w:tc>
+        <w:tc>
+          <w:tcPr>
+            <w:tcW w:type="dxa" w:w="2160"/>
+          </w:tcPr>
+          <w:p>
+            <w:r>
+              <w:t>执行审计和语法/测试验证</w:t>
             </w:r>
           </w:p>
         </w:tc>
@@ -1797,121 +1290,62 @@
     </w:tbl>
     <w:p>
       <w:pPr>
-        <w:spacing w:before="0" w:after="120" w:line="264" w:lineRule="auto"/>
-      </w:pPr>
-    </w:p>
-    <w:p>
-      <w:pPr>
-        <w:spacing w:before="320" w:after="160" w:line="264" w:lineRule="auto"/>
+        <w:pStyle w:val="Heading2"/>
       </w:pPr>
       <w:r>
-        <w:rPr>
-          <w:rFonts w:ascii="Calibri" w:hAnsi="Calibri" w:eastAsia="Songti SC"/>
-          <w:b/>
-          <w:color w:val="2E74B5"/>
-          <w:sz w:val="32"/>
-        </w:rPr>
-        <w:t>风险管理</w:t>
+        <w:t>阶段产物追踪矩阵</w:t>
       </w:r>
     </w:p>
     <w:tbl>
       <w:tblPr>
         <w:tblStyle w:val="TableGrid"/>
         <w:tblW w:type="auto" w:w="0"/>
-        <w:jc w:val="center"/>
-        <w:tblLayout w:type="autofit"/>
         <w:tblLook w:firstColumn="1" w:firstRow="1" w:lastColumn="0" w:lastRow="0" w:noHBand="0" w:noVBand="1" w:val="04A0"/>
       </w:tblPr>
       <w:tblGrid>
-        <w:gridCol w:w="3120"/>
-        <w:gridCol w:w="3120"/>
-        <w:gridCol w:w="3120"/>
+        <w:gridCol w:w="2160"/>
+        <w:gridCol w:w="2160"/>
+        <w:gridCol w:w="2160"/>
+        <w:gridCol w:w="2160"/>
       </w:tblGrid>
       <w:tr>
         <w:tc>
           <w:tcPr>
-            <w:tcW w:type="dxa" w:w="3120"/>
-            <w:shd w:fill="F2F4F7"/>
-            <w:vAlign w:val="center"/>
-            <w:tcMar>
-              <w:top w:w="80" w:type="dxa"/>
-              <w:bottom w:w="80" w:type="dxa"/>
-              <w:start w:w="120" w:type="dxa"/>
-              <w:end w:w="120" w:type="dxa"/>
-            </w:tcMar>
+            <w:tcW w:type="dxa" w:w="2160"/>
           </w:tcPr>
           <w:p>
-            <w:pPr>
-              <w:spacing w:before="0" w:after="0" w:line="264" w:lineRule="auto"/>
-              <w:jc w:val="center"/>
-            </w:pPr>
-            <w:r/>
             <w:r>
-              <w:rPr>
-                <w:rFonts w:ascii="Calibri" w:hAnsi="Calibri" w:eastAsia="Songti SC"/>
-                <w:b/>
-                <w:color w:val="000000"/>
-                <w:sz w:val="19"/>
-              </w:rPr>
-              <w:t>风险</w:t>
+              <w:t>阶段</w:t>
             </w:r>
           </w:p>
         </w:tc>
         <w:tc>
           <w:tcPr>
-            <w:tcW w:type="dxa" w:w="3120"/>
-            <w:shd w:fill="F2F4F7"/>
-            <w:vAlign w:val="center"/>
-            <w:tcMar>
-              <w:top w:w="80" w:type="dxa"/>
-              <w:bottom w:w="80" w:type="dxa"/>
-              <w:start w:w="120" w:type="dxa"/>
-              <w:end w:w="120" w:type="dxa"/>
-            </w:tcMar>
+            <w:tcW w:type="dxa" w:w="2160"/>
           </w:tcPr>
           <w:p>
-            <w:pPr>
-              <w:spacing w:before="0" w:after="0" w:line="264" w:lineRule="auto"/>
-              <w:jc w:val="center"/>
-            </w:pPr>
-            <w:r/>
             <w:r>
-              <w:rPr>
-                <w:rFonts w:ascii="Calibri" w:hAnsi="Calibri" w:eastAsia="Songti SC"/>
-                <w:b/>
-                <w:color w:val="000000"/>
-                <w:sz w:val="19"/>
-              </w:rPr>
-              <w:t>影响</w:t>
+              <w:t>要求产物</w:t>
             </w:r>
           </w:p>
         </w:tc>
         <w:tc>
           <w:tcPr>
-            <w:tcW w:type="dxa" w:w="3120"/>
-            <w:shd w:fill="F2F4F7"/>
-            <w:vAlign w:val="center"/>
-            <w:tcMar>
-              <w:top w:w="80" w:type="dxa"/>
-              <w:bottom w:w="80" w:type="dxa"/>
-              <w:start w:w="120" w:type="dxa"/>
-              <w:end w:w="120" w:type="dxa"/>
-            </w:tcMar>
+            <w:tcW w:type="dxa" w:w="2160"/>
           </w:tcPr>
           <w:p>
-            <w:pPr>
-              <w:spacing w:before="0" w:after="0" w:line="264" w:lineRule="auto"/>
-              <w:jc w:val="center"/>
-            </w:pPr>
-            <w:r/>
             <w:r>
-              <w:rPr>
-                <w:rFonts w:ascii="Calibri" w:hAnsi="Calibri" w:eastAsia="Songti SC"/>
-                <w:b/>
-                <w:color w:val="000000"/>
-                <w:sz w:val="19"/>
-              </w:rPr>
-              <w:t>应对</w:t>
+              <w:t>仓库证据</w:t>
+            </w:r>
+          </w:p>
+        </w:tc>
+        <w:tc>
+          <w:tcPr>
+            <w:tcW w:type="dxa" w:w="2160"/>
+          </w:tcPr>
+          <w:p>
+            <w:r>
+              <w:t>状态</w:t>
             </w:r>
           </w:p>
         </w:tc>
@@ -1919,85 +1353,41 @@
       <w:tr>
         <w:tc>
           <w:tcPr>
-            <w:tcW w:type="dxa" w:w="3120"/>
-            <w:vAlign w:val="center"/>
-            <w:tcMar>
-              <w:top w:w="80" w:type="dxa"/>
-              <w:bottom w:w="80" w:type="dxa"/>
-              <w:start w:w="120" w:type="dxa"/>
-              <w:end w:w="120" w:type="dxa"/>
-            </w:tcMar>
+            <w:tcW w:type="dxa" w:w="2160"/>
           </w:tcPr>
           <w:p>
-            <w:pPr>
-              <w:spacing w:before="0" w:after="0" w:line="264" w:lineRule="auto"/>
-              <w:jc w:val="center"/>
-            </w:pPr>
-            <w:r/>
             <w:r>
-              <w:rPr>
-                <w:rFonts w:ascii="Calibri" w:hAnsi="Calibri" w:eastAsia="Songti SC"/>
-                <w:b w:val="0"/>
-                <w:color w:val="000000"/>
-                <w:sz w:val="19"/>
-              </w:rPr>
-              <w:t>数据路径不一致</w:t>
+              <w:t>开题</w:t>
             </w:r>
           </w:p>
         </w:tc>
         <w:tc>
           <w:tcPr>
-            <w:tcW w:type="dxa" w:w="3120"/>
-            <w:vAlign w:val="center"/>
-            <w:tcMar>
-              <w:top w:w="80" w:type="dxa"/>
-              <w:bottom w:w="80" w:type="dxa"/>
-              <w:start w:w="120" w:type="dxa"/>
-              <w:end w:w="120" w:type="dxa"/>
-            </w:tcMar>
+            <w:tcW w:type="dxa" w:w="2160"/>
           </w:tcPr>
           <w:p>
-            <w:pPr>
-              <w:spacing w:before="0" w:after="0" w:line="264" w:lineRule="auto"/>
-              <w:jc w:val="center"/>
-            </w:pPr>
-            <w:r/>
             <w:r>
-              <w:rPr>
-                <w:rFonts w:ascii="Calibri" w:hAnsi="Calibri" w:eastAsia="Songti SC"/>
-                <w:b w:val="0"/>
-                <w:color w:val="000000"/>
-                <w:sz w:val="19"/>
-              </w:rPr>
-              <w:t>Notebook 无法运行</w:t>
+              <w:t>开题报告、PPT、需求、SRS、确认测试计划、技术预研、项目计划</w:t>
             </w:r>
           </w:p>
         </w:tc>
         <w:tc>
           <w:tcPr>
-            <w:tcW w:type="dxa" w:w="3120"/>
-            <w:vAlign w:val="center"/>
-            <w:tcMar>
-              <w:top w:w="80" w:type="dxa"/>
-              <w:bottom w:w="80" w:type="dxa"/>
-              <w:start w:w="120" w:type="dxa"/>
-              <w:end w:w="120" w:type="dxa"/>
-            </w:tcMar>
+            <w:tcW w:type="dxa" w:w="2160"/>
           </w:tcPr>
           <w:p>
-            <w:pPr>
-              <w:spacing w:before="0" w:after="0" w:line="264" w:lineRule="auto"/>
-              <w:jc w:val="left"/>
-            </w:pPr>
-            <w:r/>
             <w:r>
-              <w:rPr>
-                <w:rFonts w:ascii="Calibri" w:hAnsi="Calibri" w:eastAsia="Songti SC"/>
-                <w:b w:val="0"/>
-                <w:color w:val="000000"/>
-                <w:sz w:val="19"/>
-              </w:rPr>
-              <w:t>统一 `data/loader_roots`，禁止写个人磁盘绝对路径</w:t>
+              <w:t>`docx/md/01-06`、`outputs/*开题*.pptx`</w:t>
+            </w:r>
+          </w:p>
+        </w:tc>
+        <w:tc>
+          <w:tcPr>
+            <w:tcW w:type="dxa" w:w="2160"/>
+          </w:tcPr>
+          <w:p>
+            <w:r>
+              <w:t>已归档</w:t>
             </w:r>
           </w:p>
         </w:tc>
@@ -2005,85 +1395,41 @@
       <w:tr>
         <w:tc>
           <w:tcPr>
-            <w:tcW w:type="dxa" w:w="3120"/>
-            <w:vAlign w:val="center"/>
-            <w:tcMar>
-              <w:top w:w="80" w:type="dxa"/>
-              <w:bottom w:w="80" w:type="dxa"/>
-              <w:start w:w="120" w:type="dxa"/>
-              <w:end w:w="120" w:type="dxa"/>
-            </w:tcMar>
+            <w:tcW w:type="dxa" w:w="2160"/>
           </w:tcPr>
           <w:p>
-            <w:pPr>
-              <w:spacing w:before="0" w:after="0" w:line="264" w:lineRule="auto"/>
-              <w:jc w:val="center"/>
-            </w:pPr>
-            <w:r/>
             <w:r>
-              <w:rPr>
-                <w:rFonts w:ascii="Calibri" w:hAnsi="Calibri" w:eastAsia="Songti SC"/>
-                <w:b w:val="0"/>
-                <w:color w:val="000000"/>
-                <w:sz w:val="19"/>
-              </w:rPr>
-              <w:t>本地算力不足</w:t>
+              <w:t>中期</w:t>
             </w:r>
           </w:p>
         </w:tc>
         <w:tc>
           <w:tcPr>
-            <w:tcW w:type="dxa" w:w="3120"/>
-            <w:vAlign w:val="center"/>
-            <w:tcMar>
-              <w:top w:w="80" w:type="dxa"/>
-              <w:bottom w:w="80" w:type="dxa"/>
-              <w:start w:w="120" w:type="dxa"/>
-              <w:end w:w="120" w:type="dxa"/>
-            </w:tcMar>
+            <w:tcW w:type="dxa" w:w="2160"/>
           </w:tcPr>
           <w:p>
-            <w:pPr>
-              <w:spacing w:before="0" w:after="0" w:line="264" w:lineRule="auto"/>
-              <w:jc w:val="center"/>
-            </w:pPr>
-            <w:r/>
             <w:r>
-              <w:rPr>
-                <w:rFonts w:ascii="Calibri" w:hAnsi="Calibri" w:eastAsia="Songti SC"/>
-                <w:b w:val="0"/>
-                <w:color w:val="000000"/>
-                <w:sz w:val="19"/>
-              </w:rPr>
-              <w:t>训练时间过长</w:t>
+              <w:t>中期报告、PPT、设计、测试计划、编码规范、核心代码</w:t>
             </w:r>
           </w:p>
         </w:tc>
         <w:tc>
           <w:tcPr>
-            <w:tcW w:type="dxa" w:w="3120"/>
-            <w:vAlign w:val="center"/>
-            <w:tcMar>
-              <w:top w:w="80" w:type="dxa"/>
-              <w:bottom w:w="80" w:type="dxa"/>
-              <w:start w:w="120" w:type="dxa"/>
-              <w:end w:w="120" w:type="dxa"/>
-            </w:tcMar>
+            <w:tcW w:type="dxa" w:w="2160"/>
           </w:tcPr>
           <w:p>
-            <w:pPr>
-              <w:spacing w:before="0" w:after="0" w:line="264" w:lineRule="auto"/>
-              <w:jc w:val="left"/>
-            </w:pPr>
-            <w:r/>
             <w:r>
-              <w:rPr>
-                <w:rFonts w:ascii="Calibri" w:hAnsi="Calibri" w:eastAsia="Songti SC"/>
-                <w:b w:val="0"/>
-                <w:color w:val="000000"/>
-                <w:sz w:val="19"/>
-              </w:rPr>
-              <w:t>先跑 RUL 主线，再跑故障诊断；保留 epoch 与指标</w:t>
+              <w:t>`docx/md/07-12`、`src`、`tests`、`outputs/phm_bearing_final_report.pptx`</w:t>
+            </w:r>
+          </w:p>
+        </w:tc>
+        <w:tc>
+          <w:tcPr>
+            <w:tcW w:type="dxa" w:w="2160"/>
+          </w:tcPr>
+          <w:p>
+            <w:r>
+              <w:t>已归档</w:t>
             </w:r>
           </w:p>
         </w:tc>
@@ -2091,85 +1437,93 @@
       <w:tr>
         <w:tc>
           <w:tcPr>
-            <w:tcW w:type="dxa" w:w="3120"/>
-            <w:vAlign w:val="center"/>
-            <w:tcMar>
-              <w:top w:w="80" w:type="dxa"/>
-              <w:bottom w:w="80" w:type="dxa"/>
-              <w:start w:w="120" w:type="dxa"/>
-              <w:end w:w="120" w:type="dxa"/>
-            </w:tcMar>
+            <w:tcW w:type="dxa" w:w="2160"/>
           </w:tcPr>
           <w:p>
-            <w:pPr>
-              <w:spacing w:before="0" w:after="0" w:line="264" w:lineRule="auto"/>
-              <w:jc w:val="center"/>
-            </w:pPr>
-            <w:r/>
             <w:r>
-              <w:rPr>
-                <w:rFonts w:ascii="Calibri" w:hAnsi="Calibri" w:eastAsia="Songti SC"/>
-                <w:b w:val="0"/>
-                <w:color w:val="000000"/>
-                <w:sz w:val="19"/>
-              </w:rPr>
-              <w:t>指标与论文差距</w:t>
+              <w:t>结题</w:t>
             </w:r>
           </w:p>
         </w:tc>
         <w:tc>
           <w:tcPr>
-            <w:tcW w:type="dxa" w:w="3120"/>
-            <w:vAlign w:val="center"/>
-            <w:tcMar>
-              <w:top w:w="80" w:type="dxa"/>
-              <w:bottom w:w="80" w:type="dxa"/>
-              <w:start w:w="120" w:type="dxa"/>
-              <w:end w:w="120" w:type="dxa"/>
-            </w:tcMar>
+            <w:tcW w:type="dxa" w:w="2160"/>
           </w:tcPr>
           <w:p>
-            <w:pPr>
-              <w:spacing w:before="0" w:after="0" w:line="264" w:lineRule="auto"/>
-              <w:jc w:val="center"/>
-            </w:pPr>
-            <w:r/>
             <w:r>
-              <w:rPr>
-                <w:rFonts w:ascii="Calibri" w:hAnsi="Calibri" w:eastAsia="Songti SC"/>
-                <w:b w:val="0"/>
-                <w:color w:val="000000"/>
-                <w:sz w:val="19"/>
-              </w:rPr>
-              <w:t>答辩解释困难</w:t>
+              <w:t>结题报告、PPT、测试报告、用户手册、安装手册、源码、技术论文、贡献说明</w:t>
             </w:r>
           </w:p>
         </w:tc>
         <w:tc>
           <w:tcPr>
-            <w:tcW w:type="dxa" w:w="3120"/>
-            <w:vAlign w:val="center"/>
-            <w:tcMar>
-              <w:top w:w="80" w:type="dxa"/>
-              <w:bottom w:w="80" w:type="dxa"/>
-              <w:start w:w="120" w:type="dxa"/>
-              <w:end w:w="120" w:type="dxa"/>
-            </w:tcMar>
+            <w:tcW w:type="dxa" w:w="2160"/>
           </w:tcPr>
           <w:p>
-            <w:pPr>
-              <w:spacing w:before="0" w:after="0" w:line="264" w:lineRule="auto"/>
-              <w:jc w:val="left"/>
-            </w:pPr>
-            <w:r/>
             <w:r>
-              <w:rPr>
-                <w:rFonts w:ascii="Calibri" w:hAnsi="Calibri" w:eastAsia="Songti SC"/>
-                <w:b w:val="0"/>
-                <w:color w:val="000000"/>
-                <w:sz w:val="19"/>
-              </w:rPr>
-              <w:t>文档区分结构复现、本地复现和论文原始指标</w:t>
+              <w:t>`docx/md/13-20`、`outputs`、`reports`</w:t>
+            </w:r>
+          </w:p>
+        </w:tc>
+        <w:tc>
+          <w:tcPr>
+            <w:tcW w:type="dxa" w:w="2160"/>
+          </w:tcPr>
+          <w:p>
+            <w:r>
+              <w:t>已归档</w:t>
+            </w:r>
+          </w:p>
+        </w:tc>
+      </w:tr>
+    </w:tbl>
+    <w:p>
+      <w:pPr>
+        <w:pStyle w:val="Heading2"/>
+      </w:pPr>
+      <w:r>
+        <w:t>配置管理记录</w:t>
+      </w:r>
+    </w:p>
+    <w:tbl>
+      <w:tblPr>
+        <w:tblStyle w:val="TableGrid"/>
+        <w:tblW w:type="auto" w:w="0"/>
+        <w:tblLook w:firstColumn="1" w:firstRow="1" w:lastColumn="0" w:lastRow="0" w:noHBand="0" w:noVBand="1" w:val="04A0"/>
+      </w:tblPr>
+      <w:tblGrid>
+        <w:gridCol w:w="2880"/>
+        <w:gridCol w:w="2880"/>
+        <w:gridCol w:w="2880"/>
+      </w:tblGrid>
+      <w:tr>
+        <w:tc>
+          <w:tcPr>
+            <w:tcW w:type="dxa" w:w="2880"/>
+          </w:tcPr>
+          <w:p>
+            <w:r>
+              <w:t>配置项</w:t>
+            </w:r>
+          </w:p>
+        </w:tc>
+        <w:tc>
+          <w:tcPr>
+            <w:tcW w:type="dxa" w:w="2880"/>
+          </w:tcPr>
+          <w:p>
+            <w:r>
+              <w:t>管理方式</w:t>
+            </w:r>
+          </w:p>
+        </w:tc>
+        <w:tc>
+          <w:tcPr>
+            <w:tcW w:type="dxa" w:w="2880"/>
+          </w:tcPr>
+          <w:p>
+            <w:r>
+              <w:t>证据</w:t>
             </w:r>
           </w:p>
         </w:tc>
@@ -2177,85 +1531,159 @@
       <w:tr>
         <w:tc>
           <w:tcPr>
-            <w:tcW w:type="dxa" w:w="3120"/>
-            <w:vAlign w:val="center"/>
-            <w:tcMar>
-              <w:top w:w="80" w:type="dxa"/>
-              <w:bottom w:w="80" w:type="dxa"/>
-              <w:start w:w="120" w:type="dxa"/>
-              <w:end w:w="120" w:type="dxa"/>
-            </w:tcMar>
+            <w:tcW w:type="dxa" w:w="2880"/>
           </w:tcPr>
           <w:p>
-            <w:pPr>
-              <w:spacing w:before="0" w:after="0" w:line="264" w:lineRule="auto"/>
-              <w:jc w:val="center"/>
-            </w:pPr>
-            <w:r/>
             <w:r>
-              <w:rPr>
-                <w:rFonts w:ascii="Calibri" w:hAnsi="Calibri" w:eastAsia="Songti SC"/>
-                <w:b w:val="0"/>
-                <w:color w:val="000000"/>
-                <w:sz w:val="19"/>
-              </w:rPr>
-              <w:t>依赖漂移</w:t>
+              <w:t>源码</w:t>
             </w:r>
           </w:p>
         </w:tc>
         <w:tc>
           <w:tcPr>
-            <w:tcW w:type="dxa" w:w="3120"/>
-            <w:vAlign w:val="center"/>
-            <w:tcMar>
-              <w:top w:w="80" w:type="dxa"/>
-              <w:bottom w:w="80" w:type="dxa"/>
-              <w:start w:w="120" w:type="dxa"/>
-              <w:end w:w="120" w:type="dxa"/>
-            </w:tcMar>
+            <w:tcW w:type="dxa" w:w="2880"/>
           </w:tcPr>
           <w:p>
-            <w:pPr>
-              <w:spacing w:before="0" w:after="0" w:line="264" w:lineRule="auto"/>
-              <w:jc w:val="center"/>
-            </w:pPr>
-            <w:r/>
             <w:r>
-              <w:rPr>
-                <w:rFonts w:ascii="Calibri" w:hAnsi="Calibri" w:eastAsia="Songti SC"/>
-                <w:b w:val="0"/>
-                <w:color w:val="000000"/>
-                <w:sz w:val="19"/>
-              </w:rPr>
-              <w:t>环境不可复现</w:t>
+              <w:t>Git 分支和提交历史</w:t>
             </w:r>
           </w:p>
         </w:tc>
         <w:tc>
           <w:tcPr>
-            <w:tcW w:type="dxa" w:w="3120"/>
-            <w:vAlign w:val="center"/>
-            <w:tcMar>
-              <w:top w:w="80" w:type="dxa"/>
-              <w:bottom w:w="80" w:type="dxa"/>
-              <w:start w:w="120" w:type="dxa"/>
-              <w:end w:w="120" w:type="dxa"/>
-            </w:tcMar>
+            <w:tcW w:type="dxa" w:w="2880"/>
           </w:tcPr>
           <w:p>
-            <w:pPr>
-              <w:spacing w:before="0" w:after="0" w:line="264" w:lineRule="auto"/>
-              <w:jc w:val="left"/>
-            </w:pPr>
-            <w:r/>
             <w:r>
-              <w:rPr>
-                <w:rFonts w:ascii="Calibri" w:hAnsi="Calibri" w:eastAsia="Songti SC"/>
-                <w:b w:val="0"/>
-                <w:color w:val="000000"/>
-                <w:sz w:val="19"/>
-              </w:rPr>
-              <w:t>使用 uv 与锁文件，安装配置手册写明版本</w:t>
+              <w:t>`.git`、`src`、`tests`</w:t>
+            </w:r>
+          </w:p>
+        </w:tc>
+      </w:tr>
+      <w:tr>
+        <w:tc>
+          <w:tcPr>
+            <w:tcW w:type="dxa" w:w="2880"/>
+          </w:tcPr>
+          <w:p>
+            <w:r>
+              <w:t>依赖</w:t>
+            </w:r>
+          </w:p>
+        </w:tc>
+        <w:tc>
+          <w:tcPr>
+            <w:tcW w:type="dxa" w:w="2880"/>
+          </w:tcPr>
+          <w:p>
+            <w:r>
+              <w:t>uv 锁文件</w:t>
+            </w:r>
+          </w:p>
+        </w:tc>
+        <w:tc>
+          <w:tcPr>
+            <w:tcW w:type="dxa" w:w="2880"/>
+          </w:tcPr>
+          <w:p>
+            <w:r>
+              <w:t>`pyproject.toml`、`uv.lock`</w:t>
+            </w:r>
+          </w:p>
+        </w:tc>
+      </w:tr>
+      <w:tr>
+        <w:tc>
+          <w:tcPr>
+            <w:tcW w:type="dxa" w:w="2880"/>
+          </w:tcPr>
+          <w:p>
+            <w:r>
+              <w:t>实验配置</w:t>
+            </w:r>
+          </w:p>
+        </w:tc>
+        <w:tc>
+          <w:tcPr>
+            <w:tcW w:type="dxa" w:w="2880"/>
+          </w:tcPr>
+          <w:p>
+            <w:r>
+              <w:t>Hydra YAML</w:t>
+            </w:r>
+          </w:p>
+        </w:tc>
+        <w:tc>
+          <w:tcPr>
+            <w:tcW w:type="dxa" w:w="2880"/>
+          </w:tcPr>
+          <w:p>
+            <w:r>
+              <w:t>`conf`</w:t>
+            </w:r>
+          </w:p>
+        </w:tc>
+      </w:tr>
+      <w:tr>
+        <w:tc>
+          <w:tcPr>
+            <w:tcW w:type="dxa" w:w="2880"/>
+          </w:tcPr>
+          <w:p>
+            <w:r>
+              <w:t>运行产物</w:t>
+            </w:r>
+          </w:p>
+        </w:tc>
+        <w:tc>
+          <w:tcPr>
+            <w:tcW w:type="dxa" w:w="2880"/>
+          </w:tcPr>
+          <w:p>
+            <w:r>
+              <w:t>artifacts/reports 分目录</w:t>
+            </w:r>
+          </w:p>
+        </w:tc>
+        <w:tc>
+          <w:tcPr>
+            <w:tcW w:type="dxa" w:w="2880"/>
+          </w:tcPr>
+          <w:p>
+            <w:r>
+              <w:t>`reports`、`outputs`</w:t>
+            </w:r>
+          </w:p>
+        </w:tc>
+      </w:tr>
+      <w:tr>
+        <w:tc>
+          <w:tcPr>
+            <w:tcW w:type="dxa" w:w="2880"/>
+          </w:tcPr>
+          <w:p>
+            <w:r>
+              <w:t>大数据</w:t>
+            </w:r>
+          </w:p>
+        </w:tc>
+        <w:tc>
+          <w:tcPr>
+            <w:tcW w:type="dxa" w:w="2880"/>
+          </w:tcPr>
+          <w:p>
+            <w:r>
+              <w:t>软链接和外部目录</w:t>
+            </w:r>
+          </w:p>
+        </w:tc>
+        <w:tc>
+          <w:tcPr>
+            <w:tcW w:type="dxa" w:w="2880"/>
+          </w:tcPr>
+          <w:p>
+            <w:r>
+              <w:t>`data/loader_roots`</w:t>
             </w:r>
           </w:p>
         </w:tc>
@@ -2263,57 +1691,856 @@
     </w:tbl>
     <w:p>
       <w:pPr>
-        <w:spacing w:before="0" w:after="120" w:line="264" w:lineRule="auto"/>
+        <w:pStyle w:val="Heading2"/>
       </w:pPr>
+      <w:r>
+        <w:t>风险跟踪</w:t>
+      </w:r>
     </w:p>
+    <w:tbl>
+      <w:tblPr>
+        <w:tblStyle w:val="TableGrid"/>
+        <w:tblW w:type="auto" w:w="0"/>
+        <w:tblLook w:firstColumn="1" w:firstRow="1" w:lastColumn="0" w:lastRow="0" w:noHBand="0" w:noVBand="1" w:val="04A0"/>
+      </w:tblPr>
+      <w:tblGrid>
+        <w:gridCol w:w="2160"/>
+        <w:gridCol w:w="2160"/>
+        <w:gridCol w:w="2160"/>
+        <w:gridCol w:w="2160"/>
+      </w:tblGrid>
+      <w:tr>
+        <w:tc>
+          <w:tcPr>
+            <w:tcW w:type="dxa" w:w="2160"/>
+          </w:tcPr>
+          <w:p>
+            <w:r>
+              <w:t>风险</w:t>
+            </w:r>
+          </w:p>
+        </w:tc>
+        <w:tc>
+          <w:tcPr>
+            <w:tcW w:type="dxa" w:w="2160"/>
+          </w:tcPr>
+          <w:p>
+            <w:r>
+              <w:t>影响</w:t>
+            </w:r>
+          </w:p>
+        </w:tc>
+        <w:tc>
+          <w:tcPr>
+            <w:tcW w:type="dxa" w:w="2160"/>
+          </w:tcPr>
+          <w:p>
+            <w:r>
+              <w:t>应对</w:t>
+            </w:r>
+          </w:p>
+        </w:tc>
+        <w:tc>
+          <w:tcPr>
+            <w:tcW w:type="dxa" w:w="2160"/>
+          </w:tcPr>
+          <w:p>
+            <w:r>
+              <w:t>当前状态</w:t>
+            </w:r>
+          </w:p>
+        </w:tc>
+      </w:tr>
+      <w:tr>
+        <w:tc>
+          <w:tcPr>
+            <w:tcW w:type="dxa" w:w="2160"/>
+          </w:tcPr>
+          <w:p>
+            <w:r>
+              <w:t>原始数据过大</w:t>
+            </w:r>
+          </w:p>
+        </w:tc>
+        <w:tc>
+          <w:tcPr>
+            <w:tcW w:type="dxa" w:w="2160"/>
+          </w:tcPr>
+          <w:p>
+            <w:r>
+              <w:t>无法提交仓库</w:t>
+            </w:r>
+          </w:p>
+        </w:tc>
+        <w:tc>
+          <w:tcPr>
+            <w:tcW w:type="dxa" w:w="2160"/>
+          </w:tcPr>
+          <w:p>
+            <w:r>
+              <w:t>只提交数据说明和软链接约定</w:t>
+            </w:r>
+          </w:p>
+        </w:tc>
+        <w:tc>
+          <w:tcPr>
+            <w:tcW w:type="dxa" w:w="2160"/>
+          </w:tcPr>
+          <w:p>
+            <w:r>
+              <w:t>已控制</w:t>
+            </w:r>
+          </w:p>
+        </w:tc>
+      </w:tr>
+      <w:tr>
+        <w:tc>
+          <w:tcPr>
+            <w:tcW w:type="dxa" w:w="2160"/>
+          </w:tcPr>
+          <w:p>
+            <w:r>
+              <w:t>训练耗时长</w:t>
+            </w:r>
+          </w:p>
+        </w:tc>
+        <w:tc>
+          <w:tcPr>
+            <w:tcW w:type="dxa" w:w="2160"/>
+          </w:tcPr>
+          <w:p>
+            <w:r>
+              <w:t>难以现场复现完整训练</w:t>
+            </w:r>
+          </w:p>
+        </w:tc>
+        <w:tc>
+          <w:tcPr>
+            <w:tcW w:type="dxa" w:w="2160"/>
+          </w:tcPr>
+          <w:p>
+            <w:r>
+              <w:t>提供 50ep 视频和小数据 CLI demo</w:t>
+            </w:r>
+          </w:p>
+        </w:tc>
+        <w:tc>
+          <w:tcPr>
+            <w:tcW w:type="dxa" w:w="2160"/>
+          </w:tcPr>
+          <w:p>
+            <w:r>
+              <w:t>已控制</w:t>
+            </w:r>
+          </w:p>
+        </w:tc>
+      </w:tr>
+      <w:tr>
+        <w:tc>
+          <w:tcPr>
+            <w:tcW w:type="dxa" w:w="2160"/>
+          </w:tcPr>
+          <w:p>
+            <w:r>
+              <w:t>label-source 特征误读</w:t>
+            </w:r>
+          </w:p>
+        </w:tc>
+        <w:tc>
+          <w:tcPr>
+            <w:tcW w:type="dxa" w:w="2160"/>
+          </w:tcPr>
+          <w:p>
+            <w:r>
+              <w:t>指标解释失真</w:t>
+            </w:r>
+          </w:p>
+        </w:tc>
+        <w:tc>
+          <w:tcPr>
+            <w:tcW w:type="dxa" w:w="2160"/>
+          </w:tcPr>
+          <w:p>
+            <w:r>
+              <w:t>文档和演示中明确 caveat</w:t>
+            </w:r>
+          </w:p>
+        </w:tc>
+        <w:tc>
+          <w:tcPr>
+            <w:tcW w:type="dxa" w:w="2160"/>
+          </w:tcPr>
+          <w:p>
+            <w:r>
+              <w:t>已控制</w:t>
+            </w:r>
+          </w:p>
+        </w:tc>
+      </w:tr>
+      <w:tr>
+        <w:tc>
+          <w:tcPr>
+            <w:tcW w:type="dxa" w:w="2160"/>
+          </w:tcPr>
+          <w:p>
+            <w:r>
+              <w:t>依赖漂移</w:t>
+            </w:r>
+          </w:p>
+        </w:tc>
+        <w:tc>
+          <w:tcPr>
+            <w:tcW w:type="dxa" w:w="2160"/>
+          </w:tcPr>
+          <w:p>
+            <w:r>
+              <w:t>复现失败</w:t>
+            </w:r>
+          </w:p>
+        </w:tc>
+        <w:tc>
+          <w:tcPr>
+            <w:tcW w:type="dxa" w:w="2160"/>
+          </w:tcPr>
+          <w:p>
+            <w:r>
+              <w:t>使用 `uv.lock` 固化</w:t>
+            </w:r>
+          </w:p>
+        </w:tc>
+        <w:tc>
+          <w:tcPr>
+            <w:tcW w:type="dxa" w:w="2160"/>
+          </w:tcPr>
+          <w:p>
+            <w:r>
+              <w:t>已控制</w:t>
+            </w:r>
+          </w:p>
+        </w:tc>
+      </w:tr>
+      <w:tr>
+        <w:tc>
+          <w:tcPr>
+            <w:tcW w:type="dxa" w:w="2160"/>
+          </w:tcPr>
+          <w:p>
+            <w:r>
+              <w:t>文档数量多</w:t>
+            </w:r>
+          </w:p>
+        </w:tc>
+        <w:tc>
+          <w:tcPr>
+            <w:tcW w:type="dxa" w:w="2160"/>
+          </w:tcPr>
+          <w:p>
+            <w:r>
+              <w:t>遗漏交付项</w:t>
+            </w:r>
+          </w:p>
+        </w:tc>
+        <w:tc>
+          <w:tcPr>
+            <w:tcW w:type="dxa" w:w="2160"/>
+          </w:tcPr>
+          <w:p>
+            <w:r>
+              <w:t>使用审计脚本检查</w:t>
+            </w:r>
+          </w:p>
+        </w:tc>
+        <w:tc>
+          <w:tcPr>
+            <w:tcW w:type="dxa" w:w="2160"/>
+          </w:tcPr>
+          <w:p>
+            <w:r>
+              <w:t>已控制</w:t>
+            </w:r>
+          </w:p>
+        </w:tc>
+      </w:tr>
+    </w:tbl>
+    <w:p>
+      <w:pPr>
+        <w:pStyle w:val="Heading2"/>
+      </w:pPr>
+      <w:r>
+        <w:t>过程模型</w:t>
+      </w:r>
+    </w:p>
+    <w:p>
+      <w:r>
+        <w:t>项目采用迭代增量过程模型。每半个月形成一次可审查增量：先完成需求和计划，再完成架构与核心代码，随后补齐实验、测试、演示和交付材料。每个增量保留代码、配置、文档和演示证据。</w:t>
+      </w:r>
+    </w:p>
+    <w:p>
+      <w:pPr>
+        <w:pStyle w:val="Heading2"/>
+      </w:pPr>
+      <w:r>
+        <w:t>交付证据位置</w:t>
+      </w:r>
+    </w:p>
+    <w:tbl>
+      <w:tblPr>
+        <w:tblStyle w:val="TableGrid"/>
+        <w:tblW w:type="auto" w:w="0"/>
+        <w:tblLook w:firstColumn="1" w:firstRow="1" w:lastColumn="0" w:lastRow="0" w:noHBand="0" w:noVBand="1" w:val="04A0"/>
+      </w:tblPr>
+      <w:tblGrid>
+        <w:gridCol w:w="2880"/>
+        <w:gridCol w:w="2880"/>
+        <w:gridCol w:w="2880"/>
+      </w:tblGrid>
+      <w:tr>
+        <w:tc>
+          <w:tcPr>
+            <w:tcW w:type="dxa" w:w="2880"/>
+          </w:tcPr>
+          <w:p>
+            <w:r>
+              <w:t>证据</w:t>
+            </w:r>
+          </w:p>
+        </w:tc>
+        <w:tc>
+          <w:tcPr>
+            <w:tcW w:type="dxa" w:w="2880"/>
+          </w:tcPr>
+          <w:p>
+            <w:r>
+              <w:t>路径</w:t>
+            </w:r>
+          </w:p>
+        </w:tc>
+        <w:tc>
+          <w:tcPr>
+            <w:tcW w:type="dxa" w:w="2880"/>
+          </w:tcPr>
+          <w:p>
+            <w:r>
+              <w:t>说明</w:t>
+            </w:r>
+          </w:p>
+        </w:tc>
+      </w:tr>
+      <w:tr>
+        <w:tc>
+          <w:tcPr>
+            <w:tcW w:type="dxa" w:w="2880"/>
+          </w:tcPr>
+          <w:p>
+            <w:r>
+              <w:t>源码</w:t>
+            </w:r>
+          </w:p>
+        </w:tc>
+        <w:tc>
+          <w:tcPr>
+            <w:tcW w:type="dxa" w:w="2880"/>
+          </w:tcPr>
+          <w:p>
+            <w:r>
+              <w:t>`src/USTC/SSE/BearingPrediction`</w:t>
+            </w:r>
+          </w:p>
+        </w:tc>
+        <w:tc>
+          <w:tcPr>
+            <w:tcW w:type="dxa" w:w="2880"/>
+          </w:tcPr>
+          <w:p>
+            <w:r>
+              <w:t>项目核心实现</w:t>
+            </w:r>
+          </w:p>
+        </w:tc>
+      </w:tr>
+      <w:tr>
+        <w:tc>
+          <w:tcPr>
+            <w:tcW w:type="dxa" w:w="2880"/>
+          </w:tcPr>
+          <w:p>
+            <w:r>
+              <w:t>配置</w:t>
+            </w:r>
+          </w:p>
+        </w:tc>
+        <w:tc>
+          <w:tcPr>
+            <w:tcW w:type="dxa" w:w="2880"/>
+          </w:tcPr>
+          <w:p>
+            <w:r>
+              <w:t>`conf`</w:t>
+            </w:r>
+          </w:p>
+        </w:tc>
+        <w:tc>
+          <w:tcPr>
+            <w:tcW w:type="dxa" w:w="2880"/>
+          </w:tcPr>
+          <w:p>
+            <w:r>
+              <w:t>Hydra 配置、任务、模型、训练参数</w:t>
+            </w:r>
+          </w:p>
+        </w:tc>
+      </w:tr>
+      <w:tr>
+        <w:tc>
+          <w:tcPr>
+            <w:tcW w:type="dxa" w:w="2880"/>
+          </w:tcPr>
+          <w:p>
+            <w:r>
+              <w:t>测试</w:t>
+            </w:r>
+          </w:p>
+        </w:tc>
+        <w:tc>
+          <w:tcPr>
+            <w:tcW w:type="dxa" w:w="2880"/>
+          </w:tcPr>
+          <w:p>
+            <w:r>
+              <w:t>`tests`</w:t>
+            </w:r>
+          </w:p>
+        </w:tc>
+        <w:tc>
+          <w:tcPr>
+            <w:tcW w:type="dxa" w:w="2880"/>
+          </w:tcPr>
+          <w:p>
+            <w:r>
+              <w:t>单元、集成、CLI、recipes 测试</w:t>
+            </w:r>
+          </w:p>
+        </w:tc>
+      </w:tr>
+      <w:tr>
+        <w:tc>
+          <w:tcPr>
+            <w:tcW w:type="dxa" w:w="2880"/>
+          </w:tcPr>
+          <w:p>
+            <w:r>
+              <w:t>示例</w:t>
+            </w:r>
+          </w:p>
+        </w:tc>
+        <w:tc>
+          <w:tcPr>
+            <w:tcW w:type="dxa" w:w="2880"/>
+          </w:tcPr>
+          <w:p>
+            <w:r>
+              <w:t>`examples`</w:t>
+            </w:r>
+          </w:p>
+        </w:tc>
+        <w:tc>
+          <w:tcPr>
+            <w:tcW w:type="dxa" w:w="2880"/>
+          </w:tcPr>
+          <w:p>
+            <w:r>
+              <w:t>Notebook 指南与 Demo</w:t>
+            </w:r>
+          </w:p>
+        </w:tc>
+      </w:tr>
+      <w:tr>
+        <w:tc>
+          <w:tcPr>
+            <w:tcW w:type="dxa" w:w="2880"/>
+          </w:tcPr>
+          <w:p>
+            <w:r>
+              <w:t>用户文档</w:t>
+            </w:r>
+          </w:p>
+        </w:tc>
+        <w:tc>
+          <w:tcPr>
+            <w:tcW w:type="dxa" w:w="2880"/>
+          </w:tcPr>
+          <w:p>
+            <w:r>
+              <w:t>`user-guide`</w:t>
+            </w:r>
+          </w:p>
+        </w:tc>
+        <w:tc>
+          <w:tcPr>
+            <w:tcW w:type="dxa" w:w="2880"/>
+          </w:tcPr>
+          <w:p>
+            <w:r>
+              <w:t>数据集 card、加载与划分说明</w:t>
+            </w:r>
+          </w:p>
+        </w:tc>
+      </w:tr>
+      <w:tr>
+        <w:tc>
+          <w:tcPr>
+            <w:tcW w:type="dxa" w:w="2880"/>
+          </w:tcPr>
+          <w:p>
+            <w:r>
+              <w:t>正式文档</w:t>
+            </w:r>
+          </w:p>
+        </w:tc>
+        <w:tc>
+          <w:tcPr>
+            <w:tcW w:type="dxa" w:w="2880"/>
+          </w:tcPr>
+          <w:p>
+            <w:r>
+              <w:t>`docx/md`、`docx/word`、`docx/pdf`</w:t>
+            </w:r>
+          </w:p>
+        </w:tc>
+        <w:tc>
+          <w:tcPr>
+            <w:tcW w:type="dxa" w:w="2880"/>
+          </w:tcPr>
+          <w:p>
+            <w:r>
+              <w:t>课程交付文档</w:t>
+            </w:r>
+          </w:p>
+        </w:tc>
+      </w:tr>
+      <w:tr>
+        <w:tc>
+          <w:tcPr>
+            <w:tcW w:type="dxa" w:w="2880"/>
+          </w:tcPr>
+          <w:p>
+            <w:r>
+              <w:t>CLI 演示</w:t>
+            </w:r>
+          </w:p>
+        </w:tc>
+        <w:tc>
+          <w:tcPr>
+            <w:tcW w:type="dxa" w:w="2880"/>
+          </w:tcPr>
+          <w:p>
+            <w:r>
+              <w:t>`reports/cli_demo`</w:t>
+            </w:r>
+          </w:p>
+        </w:tc>
+        <w:tc>
+          <w:tcPr>
+            <w:tcW w:type="dxa" w:w="2880"/>
+          </w:tcPr>
+          <w:p>
+            <w:r>
+              <w:t>命令、输出、QA、manifest</w:t>
+            </w:r>
+          </w:p>
+        </w:tc>
+      </w:tr>
+      <w:tr>
+        <w:tc>
+          <w:tcPr>
+            <w:tcW w:type="dxa" w:w="2880"/>
+          </w:tcPr>
+          <w:p>
+            <w:r>
+              <w:t>Dashboard 演示</w:t>
+            </w:r>
+          </w:p>
+        </w:tc>
+        <w:tc>
+          <w:tcPr>
+            <w:tcW w:type="dxa" w:w="2880"/>
+          </w:tcPr>
+          <w:p>
+            <w:r>
+              <w:t>`reports/demo_dashboard`</w:t>
+            </w:r>
+          </w:p>
+        </w:tc>
+        <w:tc>
+          <w:tcPr>
+            <w:tcW w:type="dxa" w:w="2880"/>
+          </w:tcPr>
+          <w:p>
+            <w:r>
+              <w:t>静态网页、截图、视频</w:t>
+            </w:r>
+          </w:p>
+        </w:tc>
+      </w:tr>
+      <w:tr>
+        <w:tc>
+          <w:tcPr>
+            <w:tcW w:type="dxa" w:w="2880"/>
+          </w:tcPr>
+          <w:p>
+            <w:r>
+              <w:t>训练视频</w:t>
+            </w:r>
+          </w:p>
+        </w:tc>
+        <w:tc>
+          <w:tcPr>
+            <w:tcW w:type="dxa" w:w="2880"/>
+          </w:tcPr>
+          <w:p>
+            <w:r>
+              <w:t>`reports/demo_videos`</w:t>
+            </w:r>
+          </w:p>
+        </w:tc>
+        <w:tc>
+          <w:tcPr>
+            <w:tcW w:type="dxa" w:w="2880"/>
+          </w:tcPr>
+          <w:p>
+            <w:r>
+              <w:t>训练过程加速视频</w:t>
+            </w:r>
+          </w:p>
+        </w:tc>
+      </w:tr>
+      <w:tr>
+        <w:tc>
+          <w:tcPr>
+            <w:tcW w:type="dxa" w:w="2880"/>
+          </w:tcPr>
+          <w:p>
+            <w:r>
+              <w:t>结题材料</w:t>
+            </w:r>
+          </w:p>
+        </w:tc>
+        <w:tc>
+          <w:tcPr>
+            <w:tcW w:type="dxa" w:w="2880"/>
+          </w:tcPr>
+          <w:p>
+            <w:r>
+              <w:t>`outputs`、`reports/final_defense/report`</w:t>
+            </w:r>
+          </w:p>
+        </w:tc>
+        <w:tc>
+          <w:tcPr>
+            <w:tcW w:type="dxa" w:w="2880"/>
+          </w:tcPr>
+          <w:p>
+            <w:r>
+              <w:t>PPT、PDF、论文式报告</w:t>
+            </w:r>
+          </w:p>
+        </w:tc>
+      </w:tr>
+    </w:tbl>
+    <w:p>
+      <w:pPr>
+        <w:pStyle w:val="Heading2"/>
+      </w:pPr>
+      <w:r>
+        <w:t>外部平台与配置管理说明</w:t>
+      </w:r>
+    </w:p>
+    <w:p>
+      <w:r>
+        <w:t>《工程实践管理规范2025》建议使用太乙、禅道和 Gitee。当前仓库可见且可审计的证据为 Git/GitHub、`uv.lock`、Hydra 配置、测试记录和本地演示材料。未在仓库中出现太乙、禅道或 Gitee 的真实截图、链接、导出记录时，本文档只写等效配置管理事实，不写虚假的平台完成结论。</w:t>
+      </w:r>
+    </w:p>
+    <w:p>
+      <w:pPr>
+        <w:pStyle w:val="Heading2"/>
+      </w:pPr>
+      <w:r>
+        <w:t>质量检查口径</w:t>
+      </w:r>
+    </w:p>
+    <w:tbl>
+      <w:tblPr>
+        <w:tblStyle w:val="TableGrid"/>
+        <w:tblW w:type="auto" w:w="0"/>
+        <w:tblLook w:firstColumn="1" w:firstRow="1" w:lastColumn="0" w:lastRow="0" w:noHBand="0" w:noVBand="1" w:val="04A0"/>
+      </w:tblPr>
+      <w:tblGrid>
+        <w:gridCol w:w="4320"/>
+        <w:gridCol w:w="4320"/>
+      </w:tblGrid>
+      <w:tr>
+        <w:tc>
+          <w:tcPr>
+            <w:tcW w:type="dxa" w:w="4320"/>
+          </w:tcPr>
+          <w:p>
+            <w:r>
+              <w:t>检查项</w:t>
+            </w:r>
+          </w:p>
+        </w:tc>
+        <w:tc>
+          <w:tcPr>
+            <w:tcW w:type="dxa" w:w="4320"/>
+          </w:tcPr>
+          <w:p>
+            <w:r>
+              <w:t>通过标准</w:t>
+            </w:r>
+          </w:p>
+        </w:tc>
+      </w:tr>
+      <w:tr>
+        <w:tc>
+          <w:tcPr>
+            <w:tcW w:type="dxa" w:w="4320"/>
+          </w:tcPr>
+          <w:p>
+            <w:r>
+              <w:t>文档数量</w:t>
+            </w:r>
+          </w:p>
+        </w:tc>
+        <w:tc>
+          <w:tcPr>
+            <w:tcW w:type="dxa" w:w="4320"/>
+          </w:tcPr>
+          <w:p>
+            <w:r>
+              <w:t>Markdown、Word、PDF 各 20 份</w:t>
+            </w:r>
+          </w:p>
+        </w:tc>
+      </w:tr>
+      <w:tr>
+        <w:tc>
+          <w:tcPr>
+            <w:tcW w:type="dxa" w:w="4320"/>
+          </w:tcPr>
+          <w:p>
+            <w:r>
+              <w:t>文档内容</w:t>
+            </w:r>
+          </w:p>
+        </w:tc>
+        <w:tc>
+          <w:tcPr>
+            <w:tcW w:type="dxa" w:w="4320"/>
+          </w:tcPr>
+          <w:p>
+            <w:r>
+              <w:t>无待完善标记、空白表格或无证据结论</w:t>
+            </w:r>
+          </w:p>
+        </w:tc>
+      </w:tr>
+      <w:tr>
+        <w:tc>
+          <w:tcPr>
+            <w:tcW w:type="dxa" w:w="4320"/>
+          </w:tcPr>
+          <w:p>
+            <w:r>
+              <w:t>代码头</w:t>
+            </w:r>
+          </w:p>
+        </w:tc>
+        <w:tc>
+          <w:tcPr>
+            <w:tcW w:type="dxa" w:w="4320"/>
+          </w:tcPr>
+          <w:p>
+            <w:r>
+              <w:t>`src`、`tests`、`recipes` Python 文件均有 Author、Program date、Copyright</w:t>
+            </w:r>
+          </w:p>
+        </w:tc>
+      </w:tr>
+      <w:tr>
+        <w:tc>
+          <w:tcPr>
+            <w:tcW w:type="dxa" w:w="4320"/>
+          </w:tcPr>
+          <w:p>
+            <w:r>
+              <w:t>语法</w:t>
+            </w:r>
+          </w:p>
+        </w:tc>
+        <w:tc>
+          <w:tcPr>
+            <w:tcW w:type="dxa" w:w="4320"/>
+          </w:tcPr>
+          <w:p>
+            <w:r>
+              <w:t>`python -m compileall src tests recipes scripts` 通过</w:t>
+            </w:r>
+          </w:p>
+        </w:tc>
+      </w:tr>
+      <w:tr>
+        <w:tc>
+          <w:tcPr>
+            <w:tcW w:type="dxa" w:w="4320"/>
+          </w:tcPr>
+          <w:p>
+            <w:r>
+              <w:t>测试</w:t>
+            </w:r>
+          </w:p>
+        </w:tc>
+        <w:tc>
+          <w:tcPr>
+            <w:tcW w:type="dxa" w:w="4320"/>
+          </w:tcPr>
+          <w:p>
+            <w:r>
+              <w:t>`uv run pytest` 或目标 smoke 测试通过</w:t>
+            </w:r>
+          </w:p>
+        </w:tc>
+      </w:tr>
+      <w:tr>
+        <w:tc>
+          <w:tcPr>
+            <w:tcW w:type="dxa" w:w="4320"/>
+          </w:tcPr>
+          <w:p>
+            <w:r>
+              <w:t>演示</w:t>
+            </w:r>
+          </w:p>
+        </w:tc>
+        <w:tc>
+          <w:tcPr>
+            <w:tcW w:type="dxa" w:w="4320"/>
+          </w:tcPr>
+          <w:p>
+            <w:r>
+              <w:t>CLI、Dashboard、训练视频 manifest 为 pass</w:t>
+            </w:r>
+          </w:p>
+        </w:tc>
+      </w:tr>
+    </w:tbl>
     <w:sectPr>
-      <w:headerReference w:type="default" r:id="rId9"/>
-      <w:footerReference w:type="default" r:id="rId10"/>
       <w:pgSz w:w="12240" w:h="15840"/>
-      <w:pgMar w:top="1440" w:right="1440" w:bottom="1440" w:left="1440" w:header="708" w:footer="708" w:gutter="0"/>
+      <w:pgMar w:top="1440" w:right="1800" w:bottom="1440" w:left="1800" w:header="720" w:footer="720" w:gutter="0"/>
       <w:cols w:space="720"/>
       <w:docGrid w:linePitch="360"/>
     </w:sectPr>
   </w:body>
 </w:document>
-</file>
-
-<file path=word/footer1.xml><?xml version="1.0" encoding="utf-8"?>
-<w:ftr xmlns:m="http://schemas.openxmlformats.org/officeDocument/2006/math" xmlns:mc="http://schemas.openxmlformats.org/markup-compatibility/2006" xmlns:mo="http://schemas.microsoft.com/office/mac/office/2008/main" xmlns:mv="urn:schemas-microsoft-com:mac:vml" xmlns:o="urn:schemas-microsoft-com:office:office" xmlns:r="http://schemas.openxmlformats.org/officeDocument/2006/relationships" xmlns:v="urn:schemas-microsoft-com:vml" xmlns:w10="urn:schemas-microsoft-com:office:word" xmlns:w14="http://schemas.microsoft.com/office/word/2010/wordml" xmlns:w="http://schemas.openxmlformats.org/wordprocessingml/2006/main" xmlns:wne="http://schemas.microsoft.com/office/word/2006/wordml" xmlns:wp14="http://schemas.microsoft.com/office/word/2010/wordprocessingDrawing" xmlns:wp="http://schemas.openxmlformats.org/drawingml/2006/wordprocessingDrawing" xmlns:wpc="http://schemas.microsoft.com/office/word/2010/wordprocessingCanvas" xmlns:wpg="http://schemas.microsoft.com/office/word/2010/wordprocessingGroup" xmlns:wpi="http://schemas.microsoft.com/office/word/2010/wordprocessingInk" xmlns:wps="http://schemas.microsoft.com/office/word/2010/wordprocessingShape" mc:Ignorable="w14 wp14">
-  <w:p>
-    <w:pPr>
-      <w:pStyle w:val="Footer"/>
-      <w:jc w:val="center"/>
-    </w:pPr>
-    <w:r>
-      <w:rPr>
-        <w:rFonts w:ascii="Calibri" w:hAnsi="Calibri" w:eastAsia="Songti SC"/>
-        <w:color w:val="595959"/>
-        <w:sz w:val="18"/>
-      </w:rPr>
-      <w:t>USTC 软件工程实践课程交付文档</w:t>
-    </w:r>
-  </w:p>
-</w:ftr>
-</file>
-
-<file path=word/header1.xml><?xml version="1.0" encoding="utf-8"?>
-<w:hdr xmlns:m="http://schemas.openxmlformats.org/officeDocument/2006/math" xmlns:mc="http://schemas.openxmlformats.org/markup-compatibility/2006" xmlns:mo="http://schemas.microsoft.com/office/mac/office/2008/main" xmlns:mv="urn:schemas-microsoft-com:mac:vml" xmlns:o="urn:schemas-microsoft-com:office:office" xmlns:r="http://schemas.openxmlformats.org/officeDocument/2006/relationships" xmlns:v="urn:schemas-microsoft-com:vml" xmlns:w10="urn:schemas-microsoft-com:office:word" xmlns:w14="http://schemas.microsoft.com/office/word/2010/wordml" xmlns:w="http://schemas.openxmlformats.org/wordprocessingml/2006/main" xmlns:wne="http://schemas.microsoft.com/office/word/2006/wordml" xmlns:wp14="http://schemas.microsoft.com/office/word/2010/wordprocessingDrawing" xmlns:wp="http://schemas.openxmlformats.org/drawingml/2006/wordprocessingDrawing" xmlns:wpc="http://schemas.microsoft.com/office/word/2010/wordprocessingCanvas" xmlns:wpg="http://schemas.microsoft.com/office/word/2010/wordprocessingGroup" xmlns:wpi="http://schemas.microsoft.com/office/word/2010/wordprocessingInk" xmlns:wps="http://schemas.microsoft.com/office/word/2010/wordprocessingShape" mc:Ignorable="w14 wp14">
-  <w:p>
-    <w:pPr>
-      <w:pStyle w:val="Header"/>
-      <w:jc w:val="right"/>
-    </w:pPr>
-    <w:r>
-      <w:rPr>
-        <w:rFonts w:ascii="Calibri" w:hAnsi="Calibri" w:eastAsia="Songti SC"/>
-        <w:color w:val="595959"/>
-        <w:sz w:val="18"/>
-      </w:rPr>
-      <w:t>轴承寿命预测与故障诊断系统</w:t>
-    </w:r>
-  </w:p>
-</w:hdr>
 </file>
 
 <file path=word/numbering.xml><?xml version="1.0" encoding="utf-8"?>
@@ -2680,8 +2907,8 @@
     <w:qFormat/>
     <w:rsid w:val="00FC693F"/>
     <w:rPr>
-      <w:rFonts w:ascii="Calibri" w:hAnsi="Calibri" w:eastAsia="Songti SC"/>
-      <w:sz w:val="22"/>
+      <w:rFonts w:ascii="Arial Unicode MS" w:hAnsi="Arial Unicode MS"/>
+      <w:sz w:val="21"/>
     </w:rPr>
   </w:style>
   <w:style w:type="paragraph" w:styleId="Header">

</xml_diff>